<commit_message>
Actualiza el historial del pipeline en el RA Unidad III (23 ejecuciones)
</commit_message>
<xml_diff>
--- a/docs/RA_U3_FitCore.docx
+++ b/docs/RA_U3_FitCore.docx
@@ -5759,7 +5759,7 @@
           <w:i w:val="0"/>
           <w:sz w:val="24"/>
         </w:rPr>
-        <w:t>El historial del repositorio es la evidencia objetiva del funcionamiento del pipeline. A la fecha de corte de este documento (22 de octubre de 2026) se registran 22 ejecuciones del flujo de trabajo —20 sobre la rama main y 2 sobre la rama de trabajo feature/evidencias-ci-cd— con el siguiente distribuido de resultados: 10 ejecuciones con conclusión success, 5 con conclusión failure y 7 canceladas por la regla de concurrencia. En paralelo, el repositorio acumula 9 publicaciones versionadas en GitHub Releases, cada una con su APK descargable de aproximadamente 55,2 MB.</w:t>
+        <w:t>El historial del repositorio es la evidencia objetiva del funcionamiento del pipeline. A la fecha de corte de este documento (22 de octubre de 2026) se registran 23 ejecuciones del flujo de trabajo —20 sobre la rama main y 3 sobre ramas de trabajo— con el siguiente distribuido de resultados: 10 ejecuciones con conclusión success, 5 con conclusión failure y 8 canceladas por la regla de concurrencia. En paralelo, el repositorio acumula 9 publicaciones versionadas en GitHub Releases, cada una con su APK descargable de aproximadamente 55,2 MB.</w:t>
       </w:r>
     </w:p>
     <w:tbl>
@@ -5905,7 +5905,7 @@
               <w:rPr>
                 <w:sz w:val="20"/>
               </w:rPr>
-              <w:t>Runs 15–21</w:t>
+              <w:t>Runs 15–23</w:t>
             </w:r>
           </w:p>
         </w:tc>
@@ -5933,7 +5933,7 @@
               <w:rPr>
                 <w:sz w:val="20"/>
               </w:rPr>
-              <w:t>3 con conclusión failure y 4 canceladas</w:t>
+              <w:t>4 con conclusión failure y 5 canceladas</w:t>
             </w:r>
           </w:p>
         </w:tc>
@@ -5963,7 +5963,7 @@
               <w:rPr>
                 <w:sz w:val="20"/>
               </w:rPr>
-              <w:t>Run 22</w:t>
+              <w:t>Run 22 y run 23</w:t>
             </w:r>
           </w:p>
         </w:tc>
@@ -6856,7 +6856,7 @@
           <w:i w:val="0"/>
           <w:sz w:val="24"/>
         </w:rPr>
-        <w:t>El valor de un pipeline se demuestra, sobre todo, cuando detecta un problema. Entre el 21 y el 22 de octubre de 2026, el flujo de trabajo bloqueó ocho ejecuciones consecutivas de la rama main (runs 15 a 22). El registro siguiente documenta el ciclo completo de detección, diagnóstico, corrección y verificación, que se conserva como evidencia de la capacidad correctiva del proceso.</w:t>
+        <w:t>El valor de un pipeline se demuestra, sobre todo, cuando detecta un problema. Entre el 21 y el 22 de octubre de 2026, el flujo de trabajo bloqueó nueve ejecuciones consecutivas de la rama main (runs 15 a 23). El registro siguiente documenta el ciclo completo de detección, diagnóstico, corrección y verificación, que se conserva como evidencia de la capacidad correctiva del proceso.</w:t>
       </w:r>
     </w:p>
     <w:tbl>

</xml_diff>

<commit_message>
Agrega el apartado 'Entorno requerido' y las conclusiones al RA Unidad III
</commit_message>
<xml_diff>
--- a/docs/RA_U3_FitCore.docx
+++ b/docs/RA_U3_FitCore.docx
@@ -275,7 +275,47 @@
     </w:p>
     <w:p>
       <w:r>
-        <w:t>4. [Apartado 4 del RA — a definir en el siguiente punto]</w:t>
+        <w:t>4. Entorno requerido</w:t>
+      </w:r>
+    </w:p>
+    <w:p>
+      <w:r>
+        <w:t xml:space="preserve">   4.1 Criterios de definición del entorno</w:t>
+      </w:r>
+    </w:p>
+    <w:p>
+      <w:r>
+        <w:t xml:space="preserve">   4.2 Hardware y sistema operativo</w:t>
+      </w:r>
+    </w:p>
+    <w:p>
+      <w:r>
+        <w:t xml:space="preserve">   4.3 Software de desarrollo y versiones verificadas</w:t>
+      </w:r>
+    </w:p>
+    <w:p>
+      <w:r>
+        <w:t xml:space="preserve">   4.4 Entorno de integración continua</w:t>
+      </w:r>
+    </w:p>
+    <w:p>
+      <w:r>
+        <w:t xml:space="preserve">   4.5 Entorno de servicios en la nube (Supabase)</w:t>
+      </w:r>
+    </w:p>
+    <w:p>
+      <w:r>
+        <w:t xml:space="preserve">   4.6 Entorno de ejecución en el dispositivo cliente</w:t>
+      </w:r>
+    </w:p>
+    <w:p>
+      <w:r>
+        <w:t xml:space="preserve">   4.7 Configuración del entorno y gestión de secretos</w:t>
+      </w:r>
+    </w:p>
+    <w:p>
+      <w:r>
+        <w:t xml:space="preserve">   4.8 Verificación y reproducibilidad del entorno</w:t>
       </w:r>
     </w:p>
     <w:p>
@@ -285,7 +325,7 @@
     </w:p>
     <w:p>
       <w:r>
-        <w:t>6. Conclusiones</w:t>
+        <w:t>6. Conclusiones de la entrega actual</w:t>
       </w:r>
     </w:p>
     <w:p>
@@ -410,13 +450,20 @@
       <w:tblPr>
         <w:tblStyle w:val="LightGrid-Accent1"/>
         <w:tblW w:type="auto" w:w="0"/>
+        <w:jc w:val="center"/>
+        <w:tblLayout w:type="fixed"/>
         <w:tblLook w:firstColumn="1" w:firstRow="1" w:lastColumn="0" w:lastRow="0" w:noHBand="0" w:noVBand="1" w:val="04A0"/>
+        <w:tblLayout w:type="fixed"/>
       </w:tblPr>
       <w:tblGrid>
         <w:gridCol w:w="4703"/>
         <w:gridCol w:w="4703"/>
       </w:tblGrid>
       <w:tr>
+        <w:trPr>
+          <w:tblHeader w:val="true"/>
+          <w:cantSplit w:val="true"/>
+        </w:trPr>
         <w:tc>
           <w:tcPr>
             <w:tcW w:type="dxa" w:w="2835"/>
@@ -449,6 +496,9 @@
         </w:tc>
       </w:tr>
       <w:tr>
+        <w:trPr>
+          <w:cantSplit w:val="true"/>
+        </w:trPr>
         <w:tc>
           <w:tcPr>
             <w:tcW w:type="dxa" w:w="2835"/>
@@ -479,6 +529,9 @@
         </w:tc>
       </w:tr>
       <w:tr>
+        <w:trPr>
+          <w:cantSplit w:val="true"/>
+        </w:trPr>
         <w:tc>
           <w:tcPr>
             <w:tcW w:type="dxa" w:w="2835"/>
@@ -509,6 +562,9 @@
         </w:tc>
       </w:tr>
       <w:tr>
+        <w:trPr>
+          <w:cantSplit w:val="true"/>
+        </w:trPr>
         <w:tc>
           <w:tcPr>
             <w:tcW w:type="dxa" w:w="2835"/>
@@ -539,6 +595,9 @@
         </w:tc>
       </w:tr>
       <w:tr>
+        <w:trPr>
+          <w:cantSplit w:val="true"/>
+        </w:trPr>
         <w:tc>
           <w:tcPr>
             <w:tcW w:type="dxa" w:w="2835"/>
@@ -569,6 +628,9 @@
         </w:tc>
       </w:tr>
       <w:tr>
+        <w:trPr>
+          <w:cantSplit w:val="true"/>
+        </w:trPr>
         <w:tc>
           <w:tcPr>
             <w:tcW w:type="dxa" w:w="2835"/>
@@ -599,6 +661,9 @@
         </w:tc>
       </w:tr>
       <w:tr>
+        <w:trPr>
+          <w:cantSplit w:val="true"/>
+        </w:trPr>
         <w:tc>
           <w:tcPr>
             <w:tcW w:type="dxa" w:w="2835"/>
@@ -629,6 +694,9 @@
         </w:tc>
       </w:tr>
       <w:tr>
+        <w:trPr>
+          <w:cantSplit w:val="true"/>
+        </w:trPr>
         <w:tc>
           <w:tcPr>
             <w:tcW w:type="dxa" w:w="2835"/>
@@ -659,6 +727,9 @@
         </w:tc>
       </w:tr>
       <w:tr>
+        <w:trPr>
+          <w:cantSplit w:val="true"/>
+        </w:trPr>
         <w:tc>
           <w:tcPr>
             <w:tcW w:type="dxa" w:w="2835"/>
@@ -689,6 +760,9 @@
         </w:tc>
       </w:tr>
       <w:tr>
+        <w:trPr>
+          <w:cantSplit w:val="true"/>
+        </w:trPr>
         <w:tc>
           <w:tcPr>
             <w:tcW w:type="dxa" w:w="2835"/>
@@ -719,6 +793,9 @@
         </w:tc>
       </w:tr>
       <w:tr>
+        <w:trPr>
+          <w:cantSplit w:val="true"/>
+        </w:trPr>
         <w:tc>
           <w:tcPr>
             <w:tcW w:type="dxa" w:w="2835"/>
@@ -749,6 +826,9 @@
         </w:tc>
       </w:tr>
       <w:tr>
+        <w:trPr>
+          <w:cantSplit w:val="true"/>
+        </w:trPr>
         <w:tc>
           <w:tcPr>
             <w:tcW w:type="dxa" w:w="2835"/>
@@ -779,6 +859,9 @@
         </w:tc>
       </w:tr>
       <w:tr>
+        <w:trPr>
+          <w:cantSplit w:val="true"/>
+        </w:trPr>
         <w:tc>
           <w:tcPr>
             <w:tcW w:type="dxa" w:w="2835"/>
@@ -809,6 +892,9 @@
         </w:tc>
       </w:tr>
       <w:tr>
+        <w:trPr>
+          <w:cantSplit w:val="true"/>
+        </w:trPr>
         <w:tc>
           <w:tcPr>
             <w:tcW w:type="dxa" w:w="2835"/>
@@ -839,6 +925,9 @@
         </w:tc>
       </w:tr>
       <w:tr>
+        <w:trPr>
+          <w:cantSplit w:val="true"/>
+        </w:trPr>
         <w:tc>
           <w:tcPr>
             <w:tcW w:type="dxa" w:w="2835"/>
@@ -869,6 +958,9 @@
         </w:tc>
       </w:tr>
       <w:tr>
+        <w:trPr>
+          <w:cantSplit w:val="true"/>
+        </w:trPr>
         <w:tc>
           <w:tcPr>
             <w:tcW w:type="dxa" w:w="2835"/>
@@ -899,6 +991,9 @@
         </w:tc>
       </w:tr>
       <w:tr>
+        <w:trPr>
+          <w:cantSplit w:val="true"/>
+        </w:trPr>
         <w:tc>
           <w:tcPr>
             <w:tcW w:type="dxa" w:w="2835"/>
@@ -929,6 +1024,9 @@
         </w:tc>
       </w:tr>
       <w:tr>
+        <w:trPr>
+          <w:cantSplit w:val="true"/>
+        </w:trPr>
         <w:tc>
           <w:tcPr>
             <w:tcW w:type="dxa" w:w="2835"/>
@@ -959,6 +1057,9 @@
         </w:tc>
       </w:tr>
       <w:tr>
+        <w:trPr>
+          <w:cantSplit w:val="true"/>
+        </w:trPr>
         <w:tc>
           <w:tcPr>
             <w:tcW w:type="dxa" w:w="2835"/>
@@ -1015,7 +1116,10 @@
       <w:tblPr>
         <w:tblStyle w:val="LightGrid-Accent1"/>
         <w:tblW w:type="auto" w:w="0"/>
+        <w:jc w:val="center"/>
+        <w:tblLayout w:type="fixed"/>
         <w:tblLook w:firstColumn="1" w:firstRow="1" w:lastColumn="0" w:lastRow="0" w:noHBand="0" w:noVBand="1" w:val="04A0"/>
+        <w:tblLayout w:type="fixed"/>
       </w:tblPr>
       <w:tblGrid>
         <w:gridCol w:w="3135"/>
@@ -1023,6 +1127,10 @@
         <w:gridCol w:w="3135"/>
       </w:tblGrid>
       <w:tr>
+        <w:trPr>
+          <w:tblHeader w:val="true"/>
+          <w:cantSplit w:val="true"/>
+        </w:trPr>
         <w:tc>
           <w:tcPr>
             <w:tcW w:type="dxa" w:w="2041"/>
@@ -1070,6 +1178,9 @@
         </w:tc>
       </w:tr>
       <w:tr>
+        <w:trPr>
+          <w:cantSplit w:val="true"/>
+        </w:trPr>
         <w:tc>
           <w:tcPr>
             <w:tcW w:type="dxa" w:w="2041"/>
@@ -1114,6 +1225,9 @@
         </w:tc>
       </w:tr>
       <w:tr>
+        <w:trPr>
+          <w:cantSplit w:val="true"/>
+        </w:trPr>
         <w:tc>
           <w:tcPr>
             <w:tcW w:type="dxa" w:w="2041"/>
@@ -1158,6 +1272,9 @@
         </w:tc>
       </w:tr>
       <w:tr>
+        <w:trPr>
+          <w:cantSplit w:val="true"/>
+        </w:trPr>
         <w:tc>
           <w:tcPr>
             <w:tcW w:type="dxa" w:w="2041"/>
@@ -1202,6 +1319,9 @@
         </w:tc>
       </w:tr>
       <w:tr>
+        <w:trPr>
+          <w:cantSplit w:val="true"/>
+        </w:trPr>
         <w:tc>
           <w:tcPr>
             <w:tcW w:type="dxa" w:w="2041"/>
@@ -1246,6 +1366,9 @@
         </w:tc>
       </w:tr>
       <w:tr>
+        <w:trPr>
+          <w:cantSplit w:val="true"/>
+        </w:trPr>
         <w:tc>
           <w:tcPr>
             <w:tcW w:type="dxa" w:w="2041"/>
@@ -1290,6 +1413,9 @@
         </w:tc>
       </w:tr>
       <w:tr>
+        <w:trPr>
+          <w:cantSplit w:val="true"/>
+        </w:trPr>
         <w:tc>
           <w:tcPr>
             <w:tcW w:type="dxa" w:w="2041"/>
@@ -1334,6 +1460,9 @@
         </w:tc>
       </w:tr>
       <w:tr>
+        <w:trPr>
+          <w:cantSplit w:val="true"/>
+        </w:trPr>
         <w:tc>
           <w:tcPr>
             <w:tcW w:type="dxa" w:w="2041"/>
@@ -1378,6 +1507,9 @@
         </w:tc>
       </w:tr>
       <w:tr>
+        <w:trPr>
+          <w:cantSplit w:val="true"/>
+        </w:trPr>
         <w:tc>
           <w:tcPr>
             <w:tcW w:type="dxa" w:w="2041"/>
@@ -1422,6 +1554,9 @@
         </w:tc>
       </w:tr>
       <w:tr>
+        <w:trPr>
+          <w:cantSplit w:val="true"/>
+        </w:trPr>
         <w:tc>
           <w:tcPr>
             <w:tcW w:type="dxa" w:w="2041"/>
@@ -1466,6 +1601,9 @@
         </w:tc>
       </w:tr>
       <w:tr>
+        <w:trPr>
+          <w:cantSplit w:val="true"/>
+        </w:trPr>
         <w:tc>
           <w:tcPr>
             <w:tcW w:type="dxa" w:w="2041"/>
@@ -1510,6 +1648,9 @@
         </w:tc>
       </w:tr>
       <w:tr>
+        <w:trPr>
+          <w:cantSplit w:val="true"/>
+        </w:trPr>
         <w:tc>
           <w:tcPr>
             <w:tcW w:type="dxa" w:w="2041"/>
@@ -1662,7 +1803,10 @@
       <w:tblPr>
         <w:tblStyle w:val="LightGrid-Accent1"/>
         <w:tblW w:type="auto" w:w="0"/>
+        <w:jc w:val="center"/>
+        <w:tblLayout w:type="fixed"/>
         <w:tblLook w:firstColumn="1" w:firstRow="1" w:lastColumn="0" w:lastRow="0" w:noHBand="0" w:noVBand="1" w:val="04A0"/>
+        <w:tblLayout w:type="fixed"/>
       </w:tblPr>
       <w:tblGrid>
         <w:gridCol w:w="3135"/>
@@ -1670,6 +1814,10 @@
         <w:gridCol w:w="3135"/>
       </w:tblGrid>
       <w:tr>
+        <w:trPr>
+          <w:tblHeader w:val="true"/>
+          <w:cantSplit w:val="true"/>
+        </w:trPr>
         <w:tc>
           <w:tcPr>
             <w:tcW w:type="dxa" w:w="1701"/>
@@ -1717,6 +1865,9 @@
         </w:tc>
       </w:tr>
       <w:tr>
+        <w:trPr>
+          <w:cantSplit w:val="true"/>
+        </w:trPr>
         <w:tc>
           <w:tcPr>
             <w:tcW w:type="dxa" w:w="1701"/>
@@ -1761,6 +1912,9 @@
         </w:tc>
       </w:tr>
       <w:tr>
+        <w:trPr>
+          <w:cantSplit w:val="true"/>
+        </w:trPr>
         <w:tc>
           <w:tcPr>
             <w:tcW w:type="dxa" w:w="1701"/>
@@ -1805,6 +1959,9 @@
         </w:tc>
       </w:tr>
       <w:tr>
+        <w:trPr>
+          <w:cantSplit w:val="true"/>
+        </w:trPr>
         <w:tc>
           <w:tcPr>
             <w:tcW w:type="dxa" w:w="1701"/>
@@ -1849,6 +2006,9 @@
         </w:tc>
       </w:tr>
       <w:tr>
+        <w:trPr>
+          <w:cantSplit w:val="true"/>
+        </w:trPr>
         <w:tc>
           <w:tcPr>
             <w:tcW w:type="dxa" w:w="1701"/>
@@ -1893,6 +2053,9 @@
         </w:tc>
       </w:tr>
       <w:tr>
+        <w:trPr>
+          <w:cantSplit w:val="true"/>
+        </w:trPr>
         <w:tc>
           <w:tcPr>
             <w:tcW w:type="dxa" w:w="1701"/>
@@ -1937,6 +2100,9 @@
         </w:tc>
       </w:tr>
       <w:tr>
+        <w:trPr>
+          <w:cantSplit w:val="true"/>
+        </w:trPr>
         <w:tc>
           <w:tcPr>
             <w:tcW w:type="dxa" w:w="1701"/>
@@ -1981,6 +2147,9 @@
         </w:tc>
       </w:tr>
       <w:tr>
+        <w:trPr>
+          <w:cantSplit w:val="true"/>
+        </w:trPr>
         <w:tc>
           <w:tcPr>
             <w:tcW w:type="dxa" w:w="1701"/>
@@ -2025,6 +2194,9 @@
         </w:tc>
       </w:tr>
       <w:tr>
+        <w:trPr>
+          <w:cantSplit w:val="true"/>
+        </w:trPr>
         <w:tc>
           <w:tcPr>
             <w:tcW w:type="dxa" w:w="1701"/>
@@ -2115,7 +2287,10 @@
       <w:tblPr>
         <w:tblStyle w:val="LightGrid-Accent1"/>
         <w:tblW w:type="auto" w:w="0"/>
+        <w:jc w:val="center"/>
+        <w:tblLayout w:type="fixed"/>
         <w:tblLook w:firstColumn="1" w:firstRow="1" w:lastColumn="0" w:lastRow="0" w:noHBand="0" w:noVBand="1" w:val="04A0"/>
+        <w:tblLayout w:type="fixed"/>
       </w:tblPr>
       <w:tblGrid>
         <w:gridCol w:w="2351"/>
@@ -2124,6 +2299,10 @@
         <w:gridCol w:w="2351"/>
       </w:tblGrid>
       <w:tr>
+        <w:trPr>
+          <w:tblHeader w:val="true"/>
+          <w:cantSplit w:val="true"/>
+        </w:trPr>
         <w:tc>
           <w:tcPr>
             <w:tcW w:type="dxa" w:w="1474"/>
@@ -2186,6 +2365,9 @@
         </w:tc>
       </w:tr>
       <w:tr>
+        <w:trPr>
+          <w:cantSplit w:val="true"/>
+        </w:trPr>
         <w:tc>
           <w:tcPr>
             <w:tcW w:type="dxa" w:w="1474"/>
@@ -2244,6 +2426,9 @@
         </w:tc>
       </w:tr>
       <w:tr>
+        <w:trPr>
+          <w:cantSplit w:val="true"/>
+        </w:trPr>
         <w:tc>
           <w:tcPr>
             <w:tcW w:type="dxa" w:w="1474"/>
@@ -2302,6 +2487,9 @@
         </w:tc>
       </w:tr>
       <w:tr>
+        <w:trPr>
+          <w:cantSplit w:val="true"/>
+        </w:trPr>
         <w:tc>
           <w:tcPr>
             <w:tcW w:type="dxa" w:w="1474"/>
@@ -2360,6 +2548,9 @@
         </w:tc>
       </w:tr>
       <w:tr>
+        <w:trPr>
+          <w:cantSplit w:val="true"/>
+        </w:trPr>
         <w:tc>
           <w:tcPr>
             <w:tcW w:type="dxa" w:w="1474"/>
@@ -2418,6 +2609,9 @@
         </w:tc>
       </w:tr>
       <w:tr>
+        <w:trPr>
+          <w:cantSplit w:val="true"/>
+        </w:trPr>
         <w:tc>
           <w:tcPr>
             <w:tcW w:type="dxa" w:w="1474"/>
@@ -2476,6 +2670,9 @@
         </w:tc>
       </w:tr>
       <w:tr>
+        <w:trPr>
+          <w:cantSplit w:val="true"/>
+        </w:trPr>
         <w:tc>
           <w:tcPr>
             <w:tcW w:type="dxa" w:w="1474"/>
@@ -2570,13 +2767,20 @@
       <w:tblPr>
         <w:tblStyle w:val="LightGrid-Accent1"/>
         <w:tblW w:type="auto" w:w="0"/>
+        <w:jc w:val="center"/>
+        <w:tblLayout w:type="fixed"/>
         <w:tblLook w:firstColumn="1" w:firstRow="1" w:lastColumn="0" w:lastRow="0" w:noHBand="0" w:noVBand="1" w:val="04A0"/>
+        <w:tblLayout w:type="fixed"/>
       </w:tblPr>
       <w:tblGrid>
         <w:gridCol w:w="4703"/>
         <w:gridCol w:w="4703"/>
       </w:tblGrid>
       <w:tr>
+        <w:trPr>
+          <w:tblHeader w:val="true"/>
+          <w:cantSplit w:val="true"/>
+        </w:trPr>
         <w:tc>
           <w:tcPr>
             <w:tcW w:type="dxa" w:w="3402"/>
@@ -2609,6 +2813,9 @@
         </w:tc>
       </w:tr>
       <w:tr>
+        <w:trPr>
+          <w:cantSplit w:val="true"/>
+        </w:trPr>
         <w:tc>
           <w:tcPr>
             <w:tcW w:type="dxa" w:w="3402"/>
@@ -2639,6 +2846,9 @@
         </w:tc>
       </w:tr>
       <w:tr>
+        <w:trPr>
+          <w:cantSplit w:val="true"/>
+        </w:trPr>
         <w:tc>
           <w:tcPr>
             <w:tcW w:type="dxa" w:w="3402"/>
@@ -2669,6 +2879,9 @@
         </w:tc>
       </w:tr>
       <w:tr>
+        <w:trPr>
+          <w:cantSplit w:val="true"/>
+        </w:trPr>
         <w:tc>
           <w:tcPr>
             <w:tcW w:type="dxa" w:w="3402"/>
@@ -2699,6 +2912,9 @@
         </w:tc>
       </w:tr>
       <w:tr>
+        <w:trPr>
+          <w:cantSplit w:val="true"/>
+        </w:trPr>
         <w:tc>
           <w:tcPr>
             <w:tcW w:type="dxa" w:w="3402"/>
@@ -2729,6 +2945,9 @@
         </w:tc>
       </w:tr>
       <w:tr>
+        <w:trPr>
+          <w:cantSplit w:val="true"/>
+        </w:trPr>
         <w:tc>
           <w:tcPr>
             <w:tcW w:type="dxa" w:w="3402"/>
@@ -2759,6 +2978,9 @@
         </w:tc>
       </w:tr>
       <w:tr>
+        <w:trPr>
+          <w:cantSplit w:val="true"/>
+        </w:trPr>
         <w:tc>
           <w:tcPr>
             <w:tcW w:type="dxa" w:w="3402"/>
@@ -2789,6 +3011,9 @@
         </w:tc>
       </w:tr>
       <w:tr>
+        <w:trPr>
+          <w:cantSplit w:val="true"/>
+        </w:trPr>
         <w:tc>
           <w:tcPr>
             <w:tcW w:type="dxa" w:w="3402"/>
@@ -2819,6 +3044,9 @@
         </w:tc>
       </w:tr>
       <w:tr>
+        <w:trPr>
+          <w:cantSplit w:val="true"/>
+        </w:trPr>
         <w:tc>
           <w:tcPr>
             <w:tcW w:type="dxa" w:w="3402"/>
@@ -2849,6 +3077,9 @@
         </w:tc>
       </w:tr>
       <w:tr>
+        <w:trPr>
+          <w:cantSplit w:val="true"/>
+        </w:trPr>
         <w:tc>
           <w:tcPr>
             <w:tcW w:type="dxa" w:w="3402"/>
@@ -2879,6 +3110,9 @@
         </w:tc>
       </w:tr>
       <w:tr>
+        <w:trPr>
+          <w:cantSplit w:val="true"/>
+        </w:trPr>
         <w:tc>
           <w:tcPr>
             <w:tcW w:type="dxa" w:w="3402"/>
@@ -2909,6 +3143,9 @@
         </w:tc>
       </w:tr>
       <w:tr>
+        <w:trPr>
+          <w:cantSplit w:val="true"/>
+        </w:trPr>
         <w:tc>
           <w:tcPr>
             <w:tcW w:type="dxa" w:w="3402"/>
@@ -2939,6 +3176,9 @@
         </w:tc>
       </w:tr>
       <w:tr>
+        <w:trPr>
+          <w:cantSplit w:val="true"/>
+        </w:trPr>
         <w:tc>
           <w:tcPr>
             <w:tcW w:type="dxa" w:w="3402"/>
@@ -2969,6 +3209,9 @@
         </w:tc>
       </w:tr>
       <w:tr>
+        <w:trPr>
+          <w:cantSplit w:val="true"/>
+        </w:trPr>
         <w:tc>
           <w:tcPr>
             <w:tcW w:type="dxa" w:w="3402"/>
@@ -3051,7 +3294,10 @@
       <w:tblPr>
         <w:tblStyle w:val="LightGrid-Accent1"/>
         <w:tblW w:type="auto" w:w="0"/>
+        <w:jc w:val="center"/>
+        <w:tblLayout w:type="fixed"/>
         <w:tblLook w:firstColumn="1" w:firstRow="1" w:lastColumn="0" w:lastRow="0" w:noHBand="0" w:noVBand="1" w:val="04A0"/>
+        <w:tblLayout w:type="fixed"/>
       </w:tblPr>
       <w:tblGrid>
         <w:gridCol w:w="3135"/>
@@ -3059,6 +3305,10 @@
         <w:gridCol w:w="3135"/>
       </w:tblGrid>
       <w:tr>
+        <w:trPr>
+          <w:tblHeader w:val="true"/>
+          <w:cantSplit w:val="true"/>
+        </w:trPr>
         <w:tc>
           <w:tcPr>
             <w:tcW w:type="dxa" w:w="2608"/>
@@ -3106,6 +3356,9 @@
         </w:tc>
       </w:tr>
       <w:tr>
+        <w:trPr>
+          <w:cantSplit w:val="true"/>
+        </w:trPr>
         <w:tc>
           <w:tcPr>
             <w:tcW w:type="dxa" w:w="2608"/>
@@ -3150,6 +3403,9 @@
         </w:tc>
       </w:tr>
       <w:tr>
+        <w:trPr>
+          <w:cantSplit w:val="true"/>
+        </w:trPr>
         <w:tc>
           <w:tcPr>
             <w:tcW w:type="dxa" w:w="2608"/>
@@ -3194,6 +3450,9 @@
         </w:tc>
       </w:tr>
       <w:tr>
+        <w:trPr>
+          <w:cantSplit w:val="true"/>
+        </w:trPr>
         <w:tc>
           <w:tcPr>
             <w:tcW w:type="dxa" w:w="2608"/>
@@ -3238,6 +3497,9 @@
         </w:tc>
       </w:tr>
       <w:tr>
+        <w:trPr>
+          <w:cantSplit w:val="true"/>
+        </w:trPr>
         <w:tc>
           <w:tcPr>
             <w:tcW w:type="dxa" w:w="2608"/>
@@ -3282,6 +3544,9 @@
         </w:tc>
       </w:tr>
       <w:tr>
+        <w:trPr>
+          <w:cantSplit w:val="true"/>
+        </w:trPr>
         <w:tc>
           <w:tcPr>
             <w:tcW w:type="dxa" w:w="2608"/>
@@ -3362,7 +3627,10 @@
       <w:tblPr>
         <w:tblStyle w:val="LightGrid-Accent1"/>
         <w:tblW w:type="auto" w:w="0"/>
+        <w:jc w:val="center"/>
+        <w:tblLayout w:type="fixed"/>
         <w:tblLook w:firstColumn="1" w:firstRow="1" w:lastColumn="0" w:lastRow="0" w:noHBand="0" w:noVBand="1" w:val="04A0"/>
+        <w:tblLayout w:type="fixed"/>
       </w:tblPr>
       <w:tblGrid>
         <w:gridCol w:w="3135"/>
@@ -3370,6 +3638,10 @@
         <w:gridCol w:w="3135"/>
       </w:tblGrid>
       <w:tr>
+        <w:trPr>
+          <w:tblHeader w:val="true"/>
+          <w:cantSplit w:val="true"/>
+        </w:trPr>
         <w:tc>
           <w:tcPr>
             <w:tcW w:type="dxa" w:w="2041"/>
@@ -3417,6 +3689,9 @@
         </w:tc>
       </w:tr>
       <w:tr>
+        <w:trPr>
+          <w:cantSplit w:val="true"/>
+        </w:trPr>
         <w:tc>
           <w:tcPr>
             <w:tcW w:type="dxa" w:w="2041"/>
@@ -3461,6 +3736,9 @@
         </w:tc>
       </w:tr>
       <w:tr>
+        <w:trPr>
+          <w:cantSplit w:val="true"/>
+        </w:trPr>
         <w:tc>
           <w:tcPr>
             <w:tcW w:type="dxa" w:w="2041"/>
@@ -3505,6 +3783,9 @@
         </w:tc>
       </w:tr>
       <w:tr>
+        <w:trPr>
+          <w:cantSplit w:val="true"/>
+        </w:trPr>
         <w:tc>
           <w:tcPr>
             <w:tcW w:type="dxa" w:w="2041"/>
@@ -3549,6 +3830,9 @@
         </w:tc>
       </w:tr>
       <w:tr>
+        <w:trPr>
+          <w:cantSplit w:val="true"/>
+        </w:trPr>
         <w:tc>
           <w:tcPr>
             <w:tcW w:type="dxa" w:w="2041"/>
@@ -3593,6 +3877,9 @@
         </w:tc>
       </w:tr>
       <w:tr>
+        <w:trPr>
+          <w:cantSplit w:val="true"/>
+        </w:trPr>
         <w:tc>
           <w:tcPr>
             <w:tcW w:type="dxa" w:w="2041"/>
@@ -3637,6 +3924,9 @@
         </w:tc>
       </w:tr>
       <w:tr>
+        <w:trPr>
+          <w:cantSplit w:val="true"/>
+        </w:trPr>
         <w:tc>
           <w:tcPr>
             <w:tcW w:type="dxa" w:w="2041"/>
@@ -3717,7 +4007,10 @@
       <w:tblPr>
         <w:tblStyle w:val="LightGrid-Accent1"/>
         <w:tblW w:type="auto" w:w="0"/>
+        <w:jc w:val="center"/>
+        <w:tblLayout w:type="fixed"/>
         <w:tblLook w:firstColumn="1" w:firstRow="1" w:lastColumn="0" w:lastRow="0" w:noHBand="0" w:noVBand="1" w:val="04A0"/>
+        <w:tblLayout w:type="fixed"/>
       </w:tblPr>
       <w:tblGrid>
         <w:gridCol w:w="3135"/>
@@ -3725,6 +4018,10 @@
         <w:gridCol w:w="3135"/>
       </w:tblGrid>
       <w:tr>
+        <w:trPr>
+          <w:tblHeader w:val="true"/>
+          <w:cantSplit w:val="true"/>
+        </w:trPr>
         <w:tc>
           <w:tcPr>
             <w:tcW w:type="dxa" w:w="1928"/>
@@ -3772,6 +4069,9 @@
         </w:tc>
       </w:tr>
       <w:tr>
+        <w:trPr>
+          <w:cantSplit w:val="true"/>
+        </w:trPr>
         <w:tc>
           <w:tcPr>
             <w:tcW w:type="dxa" w:w="1928"/>
@@ -3816,6 +4116,9 @@
         </w:tc>
       </w:tr>
       <w:tr>
+        <w:trPr>
+          <w:cantSplit w:val="true"/>
+        </w:trPr>
         <w:tc>
           <w:tcPr>
             <w:tcW w:type="dxa" w:w="1928"/>
@@ -3860,6 +4163,9 @@
         </w:tc>
       </w:tr>
       <w:tr>
+        <w:trPr>
+          <w:cantSplit w:val="true"/>
+        </w:trPr>
         <w:tc>
           <w:tcPr>
             <w:tcW w:type="dxa" w:w="1928"/>
@@ -3950,7 +4256,10 @@
       <w:tblPr>
         <w:tblStyle w:val="LightGrid-Accent1"/>
         <w:tblW w:type="auto" w:w="0"/>
+        <w:jc w:val="center"/>
+        <w:tblLayout w:type="fixed"/>
         <w:tblLook w:firstColumn="1" w:firstRow="1" w:lastColumn="0" w:lastRow="0" w:noHBand="0" w:noVBand="1" w:val="04A0"/>
+        <w:tblLayout w:type="fixed"/>
       </w:tblPr>
       <w:tblGrid>
         <w:gridCol w:w="1881"/>
@@ -3960,6 +4269,10 @@
         <w:gridCol w:w="1881"/>
       </w:tblGrid>
       <w:tr>
+        <w:trPr>
+          <w:tblHeader w:val="true"/>
+          <w:cantSplit w:val="true"/>
+        </w:trPr>
         <w:tc>
           <w:tcPr>
             <w:tcW w:type="dxa" w:w="510"/>
@@ -4037,6 +4350,9 @@
         </w:tc>
       </w:tr>
       <w:tr>
+        <w:trPr>
+          <w:cantSplit w:val="true"/>
+        </w:trPr>
         <w:tc>
           <w:tcPr>
             <w:tcW w:type="dxa" w:w="510"/>
@@ -4109,6 +4425,9 @@
         </w:tc>
       </w:tr>
       <w:tr>
+        <w:trPr>
+          <w:cantSplit w:val="true"/>
+        </w:trPr>
         <w:tc>
           <w:tcPr>
             <w:tcW w:type="dxa" w:w="510"/>
@@ -4181,6 +4500,9 @@
         </w:tc>
       </w:tr>
       <w:tr>
+        <w:trPr>
+          <w:cantSplit w:val="true"/>
+        </w:trPr>
         <w:tc>
           <w:tcPr>
             <w:tcW w:type="dxa" w:w="510"/>
@@ -4253,6 +4575,9 @@
         </w:tc>
       </w:tr>
       <w:tr>
+        <w:trPr>
+          <w:cantSplit w:val="true"/>
+        </w:trPr>
         <w:tc>
           <w:tcPr>
             <w:tcW w:type="dxa" w:w="510"/>
@@ -4325,6 +4650,9 @@
         </w:tc>
       </w:tr>
       <w:tr>
+        <w:trPr>
+          <w:cantSplit w:val="true"/>
+        </w:trPr>
         <w:tc>
           <w:tcPr>
             <w:tcW w:type="dxa" w:w="510"/>
@@ -4397,6 +4725,9 @@
         </w:tc>
       </w:tr>
       <w:tr>
+        <w:trPr>
+          <w:cantSplit w:val="true"/>
+        </w:trPr>
         <w:tc>
           <w:tcPr>
             <w:tcW w:type="dxa" w:w="510"/>
@@ -4580,7 +4911,10 @@
       <w:tblPr>
         <w:tblStyle w:val="LightGrid-Accent1"/>
         <w:tblW w:type="auto" w:w="0"/>
+        <w:jc w:val="center"/>
+        <w:tblLayout w:type="fixed"/>
         <w:tblLook w:firstColumn="1" w:firstRow="1" w:lastColumn="0" w:lastRow="0" w:noHBand="0" w:noVBand="1" w:val="04A0"/>
+        <w:tblLayout w:type="fixed"/>
       </w:tblPr>
       <w:tblGrid>
         <w:gridCol w:w="1881"/>
@@ -4590,6 +4924,10 @@
         <w:gridCol w:w="1881"/>
       </w:tblGrid>
       <w:tr>
+        <w:trPr>
+          <w:tblHeader w:val="true"/>
+          <w:cantSplit w:val="true"/>
+        </w:trPr>
         <w:tc>
           <w:tcPr>
             <w:tcW w:type="dxa" w:w="3061"/>
@@ -4667,6 +5005,9 @@
         </w:tc>
       </w:tr>
       <w:tr>
+        <w:trPr>
+          <w:cantSplit w:val="true"/>
+        </w:trPr>
         <w:tc>
           <w:tcPr>
             <w:tcW w:type="dxa" w:w="3061"/>
@@ -4739,6 +5080,9 @@
         </w:tc>
       </w:tr>
       <w:tr>
+        <w:trPr>
+          <w:cantSplit w:val="true"/>
+        </w:trPr>
         <w:tc>
           <w:tcPr>
             <w:tcW w:type="dxa" w:w="3061"/>
@@ -4811,6 +5155,9 @@
         </w:tc>
       </w:tr>
       <w:tr>
+        <w:trPr>
+          <w:cantSplit w:val="true"/>
+        </w:trPr>
         <w:tc>
           <w:tcPr>
             <w:tcW w:type="dxa" w:w="3061"/>
@@ -4883,6 +5230,9 @@
         </w:tc>
       </w:tr>
       <w:tr>
+        <w:trPr>
+          <w:cantSplit w:val="true"/>
+        </w:trPr>
         <w:tc>
           <w:tcPr>
             <w:tcW w:type="dxa" w:w="3061"/>
@@ -4955,6 +5305,9 @@
         </w:tc>
       </w:tr>
       <w:tr>
+        <w:trPr>
+          <w:cantSplit w:val="true"/>
+        </w:trPr>
         <w:tc>
           <w:tcPr>
             <w:tcW w:type="dxa" w:w="3061"/>
@@ -5027,6 +5380,9 @@
         </w:tc>
       </w:tr>
       <w:tr>
+        <w:trPr>
+          <w:cantSplit w:val="true"/>
+        </w:trPr>
         <w:tc>
           <w:tcPr>
             <w:tcW w:type="dxa" w:w="3061"/>
@@ -5099,6 +5455,9 @@
         </w:tc>
       </w:tr>
       <w:tr>
+        <w:trPr>
+          <w:cantSplit w:val="true"/>
+        </w:trPr>
         <w:tc>
           <w:tcPr>
             <w:tcW w:type="dxa" w:w="3061"/>
@@ -5171,6 +5530,9 @@
         </w:tc>
       </w:tr>
       <w:tr>
+        <w:trPr>
+          <w:cantSplit w:val="true"/>
+        </w:trPr>
         <w:tc>
           <w:tcPr>
             <w:tcW w:type="dxa" w:w="3061"/>
@@ -5289,7 +5651,10 @@
       <w:tblPr>
         <w:tblStyle w:val="LightGrid-Accent1"/>
         <w:tblW w:type="auto" w:w="0"/>
+        <w:jc w:val="center"/>
+        <w:tblLayout w:type="fixed"/>
         <w:tblLook w:firstColumn="1" w:firstRow="1" w:lastColumn="0" w:lastRow="0" w:noHBand="0" w:noVBand="1" w:val="04A0"/>
+        <w:tblLayout w:type="fixed"/>
       </w:tblPr>
       <w:tblGrid>
         <w:gridCol w:w="3135"/>
@@ -5297,6 +5662,10 @@
         <w:gridCol w:w="3135"/>
       </w:tblGrid>
       <w:tr>
+        <w:trPr>
+          <w:tblHeader w:val="true"/>
+          <w:cantSplit w:val="true"/>
+        </w:trPr>
         <w:tc>
           <w:tcPr>
             <w:tcW w:type="dxa" w:w="2494"/>
@@ -5344,6 +5713,9 @@
         </w:tc>
       </w:tr>
       <w:tr>
+        <w:trPr>
+          <w:cantSplit w:val="true"/>
+        </w:trPr>
         <w:tc>
           <w:tcPr>
             <w:tcW w:type="dxa" w:w="2494"/>
@@ -5388,6 +5760,9 @@
         </w:tc>
       </w:tr>
       <w:tr>
+        <w:trPr>
+          <w:cantSplit w:val="true"/>
+        </w:trPr>
         <w:tc>
           <w:tcPr>
             <w:tcW w:type="dxa" w:w="2494"/>
@@ -5432,6 +5807,9 @@
         </w:tc>
       </w:tr>
       <w:tr>
+        <w:trPr>
+          <w:cantSplit w:val="true"/>
+        </w:trPr>
         <w:tc>
           <w:tcPr>
             <w:tcW w:type="dxa" w:w="2494"/>
@@ -5476,6 +5854,9 @@
         </w:tc>
       </w:tr>
       <w:tr>
+        <w:trPr>
+          <w:cantSplit w:val="true"/>
+        </w:trPr>
         <w:tc>
           <w:tcPr>
             <w:tcW w:type="dxa" w:w="2494"/>
@@ -5520,6 +5901,9 @@
         </w:tc>
       </w:tr>
       <w:tr>
+        <w:trPr>
+          <w:cantSplit w:val="true"/>
+        </w:trPr>
         <w:tc>
           <w:tcPr>
             <w:tcW w:type="dxa" w:w="2494"/>
@@ -5564,6 +5948,9 @@
         </w:tc>
       </w:tr>
       <w:tr>
+        <w:trPr>
+          <w:cantSplit w:val="true"/>
+        </w:trPr>
         <w:tc>
           <w:tcPr>
             <w:tcW w:type="dxa" w:w="2494"/>
@@ -5608,6 +5995,9 @@
         </w:tc>
       </w:tr>
       <w:tr>
+        <w:trPr>
+          <w:cantSplit w:val="true"/>
+        </w:trPr>
         <w:tc>
           <w:tcPr>
             <w:tcW w:type="dxa" w:w="2494"/>
@@ -5652,6 +6042,9 @@
         </w:tc>
       </w:tr>
       <w:tr>
+        <w:trPr>
+          <w:cantSplit w:val="true"/>
+        </w:trPr>
         <w:tc>
           <w:tcPr>
             <w:tcW w:type="dxa" w:w="2494"/>
@@ -5696,6 +6089,9 @@
         </w:tc>
       </w:tr>
       <w:tr>
+        <w:trPr>
+          <w:cantSplit w:val="true"/>
+        </w:trPr>
         <w:tc>
           <w:tcPr>
             <w:tcW w:type="dxa" w:w="2494"/>
@@ -5759,14 +6155,17 @@
           <w:i w:val="0"/>
           <w:sz w:val="24"/>
         </w:rPr>
-        <w:t>El historial del repositorio es la evidencia objetiva del funcionamiento del pipeline. A la fecha de corte de este documento (22 de octubre de 2026) se registran 23 ejecuciones del flujo de trabajo —20 sobre la rama main y 3 sobre ramas de trabajo— con el siguiente distribuido de resultados: 10 ejecuciones con conclusión success, 5 con conclusión failure y 8 canceladas por la regla de concurrencia. En paralelo, el repositorio acumula 9 publicaciones versionadas en GitHub Releases, cada una con su APK descargable de aproximadamente 55,2 MB.</w:t>
+        <w:t>El historial del repositorio es la evidencia objetiva del funcionamiento del pipeline. A la fecha de corte de este documento (21 de octubre de 2026) se registran 24 ejecuciones del flujo de trabajo —21 sobre la rama main y 3 sobre ramas de trabajo— con el siguiente distribuido de resultados: 10 ejecuciones con conclusión success, 7 con conclusión failure y 7 canceladas por la regla de concurrencia. En paralelo, el repositorio acumula 9 publicaciones versionadas en GitHub Releases, cada una con su APK descargable de aproximadamente 55,2 MB.</w:t>
       </w:r>
     </w:p>
     <w:tbl>
       <w:tblPr>
         <w:tblStyle w:val="LightGrid-Accent1"/>
         <w:tblW w:type="auto" w:w="0"/>
+        <w:jc w:val="center"/>
+        <w:tblLayout w:type="fixed"/>
         <w:tblLook w:firstColumn="1" w:firstRow="1" w:lastColumn="0" w:lastRow="0" w:noHBand="0" w:noVBand="1" w:val="04A0"/>
+        <w:tblLayout w:type="fixed"/>
       </w:tblPr>
       <w:tblGrid>
         <w:gridCol w:w="2351"/>
@@ -5775,6 +6174,10 @@
         <w:gridCol w:w="2351"/>
       </w:tblGrid>
       <w:tr>
+        <w:trPr>
+          <w:tblHeader w:val="true"/>
+          <w:cantSplit w:val="true"/>
+        </w:trPr>
         <w:tc>
           <w:tcPr>
             <w:tcW w:type="dxa" w:w="1474"/>
@@ -5837,6 +6240,9 @@
         </w:tc>
       </w:tr>
       <w:tr>
+        <w:trPr>
+          <w:cantSplit w:val="true"/>
+        </w:trPr>
         <w:tc>
           <w:tcPr>
             <w:tcW w:type="dxa" w:w="1474"/>
@@ -5895,6 +6301,9 @@
         </w:tc>
       </w:tr>
       <w:tr>
+        <w:trPr>
+          <w:cantSplit w:val="true"/>
+        </w:trPr>
         <w:tc>
           <w:tcPr>
             <w:tcW w:type="dxa" w:w="1474"/>
@@ -5905,7 +6314,7 @@
               <w:rPr>
                 <w:sz w:val="20"/>
               </w:rPr>
-              <w:t>Runs 15–23</w:t>
+              <w:t>Runs 15–24</w:t>
             </w:r>
           </w:p>
         </w:tc>
@@ -5933,7 +6342,7 @@
               <w:rPr>
                 <w:sz w:val="20"/>
               </w:rPr>
-              <w:t>4 con conclusión failure y 5 canceladas</w:t>
+              <w:t>6 con conclusión failure y 4 canceladas</w:t>
             </w:r>
           </w:p>
         </w:tc>
@@ -5953,6 +6362,9 @@
         </w:tc>
       </w:tr>
       <w:tr>
+        <w:trPr>
+          <w:cantSplit w:val="true"/>
+        </w:trPr>
         <w:tc>
           <w:tcPr>
             <w:tcW w:type="dxa" w:w="1474"/>
@@ -5963,7 +6375,7 @@
               <w:rPr>
                 <w:sz w:val="20"/>
               </w:rPr>
-              <w:t>Run 22 y run 23</w:t>
+              <w:t>Runs 22, 23 y 24</w:t>
             </w:r>
           </w:p>
         </w:tc>
@@ -6011,6 +6423,9 @@
         </w:tc>
       </w:tr>
       <w:tr>
+        <w:trPr>
+          <w:cantSplit w:val="true"/>
+        </w:trPr>
         <w:tc>
           <w:tcPr>
             <w:tcW w:type="dxa" w:w="1474"/>
@@ -6077,7 +6492,7 @@
           <w:i w:val="0"/>
           <w:sz w:val="24"/>
         </w:rPr>
-        <w:t>La lectura conjunta de estos datos es la que sostiene la afirmación central de este apartado: el flujo de trabajo no es decorativo, es funcional y es selectivo. En las ejecuciones 15 a 22 el pipeline se comportó exactamente como se diseñó: la compilación del APK se completó porque las etapas técnicas eran correctas, y la publicación se omitió porque el contrato de la API no se cumplía. En un proceso manual, esa versión defectuosa habría llegado al usuario final.</w:t>
+        <w:t>La lectura conjunta de estos datos es la que sostiene la afirmación central de este apartado: el flujo de trabajo no es decorativo, es funcional y es selectivo. En las ejecuciones 15 a 24 el pipeline se comportó exactamente como se diseñó: la compilación del APK se completó porque las etapas técnicas eran correctas, y la publicación se omitió porque el contrato de la API no se cumplía. En un proceso manual, esa versión defectuosa habría llegado al usuario final.</w:t>
       </w:r>
     </w:p>
     <w:p>
@@ -6135,13 +6550,20 @@
       <w:tblPr>
         <w:tblStyle w:val="LightGrid-Accent1"/>
         <w:tblW w:type="auto" w:w="0"/>
+        <w:jc w:val="center"/>
+        <w:tblLayout w:type="fixed"/>
         <w:tblLook w:firstColumn="1" w:firstRow="1" w:lastColumn="0" w:lastRow="0" w:noHBand="0" w:noVBand="1" w:val="04A0"/>
+        <w:tblLayout w:type="fixed"/>
       </w:tblPr>
       <w:tblGrid>
         <w:gridCol w:w="4703"/>
         <w:gridCol w:w="4703"/>
       </w:tblGrid>
       <w:tr>
+        <w:trPr>
+          <w:tblHeader w:val="true"/>
+          <w:cantSplit w:val="true"/>
+        </w:trPr>
         <w:tc>
           <w:tcPr>
             <w:tcW w:type="dxa" w:w="4535"/>
@@ -6174,6 +6596,9 @@
         </w:tc>
       </w:tr>
       <w:tr>
+        <w:trPr>
+          <w:cantSplit w:val="true"/>
+        </w:trPr>
         <w:tc>
           <w:tcPr>
             <w:tcW w:type="dxa" w:w="4535"/>
@@ -6204,6 +6629,9 @@
         </w:tc>
       </w:tr>
       <w:tr>
+        <w:trPr>
+          <w:cantSplit w:val="true"/>
+        </w:trPr>
         <w:tc>
           <w:tcPr>
             <w:tcW w:type="dxa" w:w="4535"/>
@@ -6234,6 +6662,9 @@
         </w:tc>
       </w:tr>
       <w:tr>
+        <w:trPr>
+          <w:cantSplit w:val="true"/>
+        </w:trPr>
         <w:tc>
           <w:tcPr>
             <w:tcW w:type="dxa" w:w="4535"/>
@@ -6264,6 +6695,9 @@
         </w:tc>
       </w:tr>
       <w:tr>
+        <w:trPr>
+          <w:cantSplit w:val="true"/>
+        </w:trPr>
         <w:tc>
           <w:tcPr>
             <w:tcW w:type="dxa" w:w="4535"/>
@@ -6294,6 +6728,9 @@
         </w:tc>
       </w:tr>
       <w:tr>
+        <w:trPr>
+          <w:cantSplit w:val="true"/>
+        </w:trPr>
         <w:tc>
           <w:tcPr>
             <w:tcW w:type="dxa" w:w="4535"/>
@@ -6324,6 +6761,9 @@
         </w:tc>
       </w:tr>
       <w:tr>
+        <w:trPr>
+          <w:cantSplit w:val="true"/>
+        </w:trPr>
         <w:tc>
           <w:tcPr>
             <w:tcW w:type="dxa" w:w="4535"/>
@@ -6354,6 +6794,9 @@
         </w:tc>
       </w:tr>
       <w:tr>
+        <w:trPr>
+          <w:cantSplit w:val="true"/>
+        </w:trPr>
         <w:tc>
           <w:tcPr>
             <w:tcW w:type="dxa" w:w="4535"/>
@@ -6856,20 +7299,27 @@
           <w:i w:val="0"/>
           <w:sz w:val="24"/>
         </w:rPr>
-        <w:t>El valor de un pipeline se demuestra, sobre todo, cuando detecta un problema. Entre el 21 y el 22 de octubre de 2026, el flujo de trabajo bloqueó nueve ejecuciones consecutivas de la rama main (runs 15 a 23). El registro siguiente documenta el ciclo completo de detección, diagnóstico, corrección y verificación, que se conserva como evidencia de la capacidad correctiva del proceso.</w:t>
+        <w:t>El valor de un pipeline se demuestra, sobre todo, cuando detecta un problema. Entre el 20 y el 21 de octubre de 2026, el flujo de trabajo bloqueó diez ejecuciones consecutivas de la rama main (runs 15 a 24). El registro siguiente documenta el ciclo completo de detección, diagnóstico, corrección y verificación, que se conserva como evidencia de la capacidad correctiva del proceso.</w:t>
       </w:r>
     </w:p>
     <w:tbl>
       <w:tblPr>
         <w:tblStyle w:val="LightGrid-Accent1"/>
         <w:tblW w:type="auto" w:w="0"/>
+        <w:jc w:val="center"/>
+        <w:tblLayout w:type="fixed"/>
         <w:tblLook w:firstColumn="1" w:firstRow="1" w:lastColumn="0" w:lastRow="0" w:noHBand="0" w:noVBand="1" w:val="04A0"/>
+        <w:tblLayout w:type="fixed"/>
       </w:tblPr>
       <w:tblGrid>
         <w:gridCol w:w="4703"/>
         <w:gridCol w:w="4703"/>
       </w:tblGrid>
       <w:tr>
+        <w:trPr>
+          <w:tblHeader w:val="true"/>
+          <w:cantSplit w:val="true"/>
+        </w:trPr>
         <w:tc>
           <w:tcPr>
             <w:tcW w:type="dxa" w:w="1814"/>
@@ -6902,6 +7352,9 @@
         </w:tc>
       </w:tr>
       <w:tr>
+        <w:trPr>
+          <w:cantSplit w:val="true"/>
+        </w:trPr>
         <w:tc>
           <w:tcPr>
             <w:tcW w:type="dxa" w:w="1814"/>
@@ -6926,12 +7379,15 @@
               <w:rPr>
                 <w:sz w:val="20"/>
               </w:rPr>
-              <w:t>Las ejecuciones 15 a 22 terminan con conclusión failure en la etapa «Pruebas de API (Postman/Newman)», mientras que las etapas de entorno, calidad, pruebas y compilación terminan en success. El pipeline, por diseño, omite la etapa de despliegue.</w:t>
+              <w:t>Las ejecuciones 15 a 24 terminan con conclusión failure en la etapa «Pruebas de API (Postman/Newman)», mientras que las etapas de entorno, calidad, pruebas y compilación terminan en success. El pipeline, por diseño, omite la etapa de despliegue.</w:t>
             </w:r>
           </w:p>
         </w:tc>
       </w:tr>
       <w:tr>
+        <w:trPr>
+          <w:cantSplit w:val="true"/>
+        </w:trPr>
         <w:tc>
           <w:tcPr>
             <w:tcW w:type="dxa" w:w="1814"/>
@@ -6962,6 +7418,9 @@
         </w:tc>
       </w:tr>
       <w:tr>
+        <w:trPr>
+          <w:cantSplit w:val="true"/>
+        </w:trPr>
         <w:tc>
           <w:tcPr>
             <w:tcW w:type="dxa" w:w="1814"/>
@@ -6992,6 +7451,9 @@
         </w:tc>
       </w:tr>
       <w:tr>
+        <w:trPr>
+          <w:cantSplit w:val="true"/>
+        </w:trPr>
         <w:tc>
           <w:tcPr>
             <w:tcW w:type="dxa" w:w="1814"/>
@@ -7022,6 +7484,9 @@
         </w:tc>
       </w:tr>
       <w:tr>
+        <w:trPr>
+          <w:cantSplit w:val="true"/>
+        </w:trPr>
         <w:tc>
           <w:tcPr>
             <w:tcW w:type="dxa" w:w="1814"/>
@@ -7052,6 +7517,9 @@
         </w:tc>
       </w:tr>
       <w:tr>
+        <w:trPr>
+          <w:cantSplit w:val="true"/>
+        </w:trPr>
         <w:tc>
           <w:tcPr>
             <w:tcW w:type="dxa" w:w="1814"/>
@@ -7118,7 +7586,10 @@
       <w:tblPr>
         <w:tblStyle w:val="LightGrid-Accent1"/>
         <w:tblW w:type="auto" w:w="0"/>
+        <w:jc w:val="center"/>
+        <w:tblLayout w:type="fixed"/>
         <w:tblLook w:firstColumn="1" w:firstRow="1" w:lastColumn="0" w:lastRow="0" w:noHBand="0" w:noVBand="1" w:val="04A0"/>
+        <w:tblLayout w:type="fixed"/>
       </w:tblPr>
       <w:tblGrid>
         <w:gridCol w:w="3135"/>
@@ -7126,6 +7597,10 @@
         <w:gridCol w:w="3135"/>
       </w:tblGrid>
       <w:tr>
+        <w:trPr>
+          <w:tblHeader w:val="true"/>
+          <w:cantSplit w:val="true"/>
+        </w:trPr>
         <w:tc>
           <w:tcPr>
             <w:tcW w:type="dxa" w:w="2041"/>
@@ -7173,6 +7648,9 @@
         </w:tc>
       </w:tr>
       <w:tr>
+        <w:trPr>
+          <w:cantSplit w:val="true"/>
+        </w:trPr>
         <w:tc>
           <w:tcPr>
             <w:tcW w:type="dxa" w:w="2041"/>
@@ -7217,6 +7695,9 @@
         </w:tc>
       </w:tr>
       <w:tr>
+        <w:trPr>
+          <w:cantSplit w:val="true"/>
+        </w:trPr>
         <w:tc>
           <w:tcPr>
             <w:tcW w:type="dxa" w:w="2041"/>
@@ -7261,6 +7742,9 @@
         </w:tc>
       </w:tr>
       <w:tr>
+        <w:trPr>
+          <w:cantSplit w:val="true"/>
+        </w:trPr>
         <w:tc>
           <w:tcPr>
             <w:tcW w:type="dxa" w:w="2041"/>
@@ -7305,6 +7789,9 @@
         </w:tc>
       </w:tr>
       <w:tr>
+        <w:trPr>
+          <w:cantSplit w:val="true"/>
+        </w:trPr>
         <w:tc>
           <w:tcPr>
             <w:tcW w:type="dxa" w:w="2041"/>
@@ -7349,6 +7836,9 @@
         </w:tc>
       </w:tr>
       <w:tr>
+        <w:trPr>
+          <w:cantSplit w:val="true"/>
+        </w:trPr>
         <w:tc>
           <w:tcPr>
             <w:tcW w:type="dxa" w:w="2041"/>
@@ -7393,6 +7883,9 @@
         </w:tc>
       </w:tr>
       <w:tr>
+        <w:trPr>
+          <w:cantSplit w:val="true"/>
+        </w:trPr>
         <w:tc>
           <w:tcPr>
             <w:tcW w:type="dxa" w:w="2041"/>
@@ -7437,6 +7930,9 @@
         </w:tc>
       </w:tr>
       <w:tr>
+        <w:trPr>
+          <w:cantSplit w:val="true"/>
+        </w:trPr>
         <w:tc>
           <w:tcPr>
             <w:tcW w:type="dxa" w:w="2041"/>
@@ -7505,7 +8001,2988 @@
         <w:rPr>
           <w:color w:val="1E40AF"/>
         </w:rPr>
-        <w:t>4. [Apartado 4 del RA — a definir en el siguiente punto]</w:t>
+        <w:t>4. Entorno requerido</w:t>
+      </w:r>
+    </w:p>
+    <w:p>
+      <w:r>
+        <w:rPr>
+          <w:b w:val="0"/>
+          <w:i w:val="0"/>
+          <w:sz w:val="24"/>
+        </w:rPr>
+        <w:t>Todo el proceso de desarrollo, integración, liberación y despliegue descrito en los apartados anteriores se ejecuta sobre un entorno con características concretas y verificables. Este apartado documenta esas características en tres dimensiones: el entorno de desarrollo local del equipo, el entorno de integración continua donde se compila y publica el producto, y el entorno de servicios en la nube y de dispositivo cliente donde la aplicación se ejecuta. La documentación de un producto que se publica en línea exige que cualquiera pueda reproducir el proceso, por lo que cada requisito se presenta con la fuente exacta en la que se declara dentro del repositorio.</w:t>
+      </w:r>
+    </w:p>
+    <w:p>
+      <w:pPr>
+        <w:pStyle w:val="Heading2"/>
+      </w:pPr>
+      <w:r>
+        <w:rPr>
+          <w:color w:val="1E40AF"/>
+        </w:rPr>
+        <w:t>4.1 Criterios de definición del entorno</w:t>
+      </w:r>
+    </w:p>
+    <w:p>
+      <w:r>
+        <w:rPr>
+          <w:b w:val="0"/>
+          <w:i w:val="0"/>
+          <w:sz w:val="24"/>
+        </w:rPr>
+        <w:t>Los requisitos del entorno se definieron con tres criterios:</w:t>
+      </w:r>
+    </w:p>
+    <w:p>
+      <w:pPr>
+        <w:pStyle w:val="ListBullet"/>
+      </w:pPr>
+      <w:r>
+        <w:t>Fijación de versiones: toda la cadena de herramientas queda fijada a una versión concreta (Flutter, Java, Node, Gradle, AGP, Kotlin y NDK) para que el binario publicado sea reproducible en cualquier máquina y en cualquier momento.</w:t>
+      </w:r>
+    </w:p>
+    <w:p>
+      <w:pPr>
+        <w:pStyle w:val="ListBullet"/>
+      </w:pPr>
+      <w:r>
+        <w:t>Trazabilidad documental: cada requisito indica el archivo del repositorio en el que se declara, de modo que el entorno es auditable y no depende de un conocimiento informal del equipo.</w:t>
+      </w:r>
+    </w:p>
+    <w:p>
+      <w:pPr>
+        <w:pStyle w:val="ListBullet"/>
+      </w:pPr>
+      <w:r>
+        <w:t>Separación de secretos: ninguna credencial forma parte del entorno versionado; el entorno se parametriza mediante secretos del repositorio y la inyección de variables de en tiempo de compilación.</w:t>
+      </w:r>
+    </w:p>
+    <w:p>
+      <w:pPr>
+        <w:pStyle w:val="Heading2"/>
+      </w:pPr>
+      <w:r>
+        <w:rPr>
+          <w:color w:val="1E40AF"/>
+        </w:rPr>
+        <w:t>4.2 Hardware y sistema operativo</w:t>
+      </w:r>
+    </w:p>
+    <w:p>
+      <w:r>
+        <w:rPr>
+          <w:b w:val="0"/>
+          <w:i w:val="0"/>
+          <w:sz w:val="24"/>
+        </w:rPr>
+        <w:t>El proyecto es una aplicación Flutter con salidas para Android, iOS, web, Windows, macOS y Linux (las seis carpetas de plataforma están presentes en el repositorio), si bien la publicación de la versión 1.0 se realiza exclusivamente para Android. Los requisitos de hardware y sistema operativo son los siguientes:</w:t>
+      </w:r>
+    </w:p>
+    <w:tbl>
+      <w:tblPr>
+        <w:tblStyle w:val="LightGrid-Accent1"/>
+        <w:tblW w:type="auto" w:w="0"/>
+        <w:jc w:val="center"/>
+        <w:tblLayout w:type="fixed"/>
+        <w:tblLook w:firstColumn="1" w:firstRow="1" w:lastColumn="0" w:lastRow="0" w:noHBand="0" w:noVBand="1" w:val="04A0"/>
+        <w:tblLayout w:type="fixed"/>
+      </w:tblPr>
+      <w:tblGrid>
+        <w:gridCol w:w="3135"/>
+        <w:gridCol w:w="3135"/>
+        <w:gridCol w:w="3135"/>
+      </w:tblGrid>
+      <w:tr>
+        <w:trPr>
+          <w:tblHeader w:val="true"/>
+          <w:cantSplit w:val="true"/>
+        </w:trPr>
+        <w:tc>
+          <w:tcPr>
+            <w:tcW w:type="dxa" w:w="2041"/>
+          </w:tcPr>
+          <w:p>
+            <w:r/>
+            <w:r>
+              <w:rPr>
+                <w:b/>
+                <w:sz w:val="20"/>
+              </w:rPr>
+              <w:t>Elemento</w:t>
+            </w:r>
+          </w:p>
+        </w:tc>
+        <w:tc>
+          <w:tcPr>
+            <w:tcW w:type="dxa" w:w="4195"/>
+          </w:tcPr>
+          <w:p>
+            <w:r/>
+            <w:r>
+              <w:rPr>
+                <w:b/>
+                <w:sz w:val="20"/>
+              </w:rPr>
+              <w:t>Requisito</w:t>
+            </w:r>
+          </w:p>
+        </w:tc>
+        <w:tc>
+          <w:tcPr>
+            <w:tcW w:type="dxa" w:w="2835"/>
+          </w:tcPr>
+          <w:p>
+            <w:r/>
+            <w:r>
+              <w:rPr>
+                <w:b/>
+                <w:sz w:val="20"/>
+              </w:rPr>
+              <w:t>Origen del dato</w:t>
+            </w:r>
+          </w:p>
+        </w:tc>
+      </w:tr>
+      <w:tr>
+        <w:trPr>
+          <w:cantSplit w:val="true"/>
+        </w:trPr>
+        <w:tc>
+          <w:tcPr>
+            <w:tcW w:type="dxa" w:w="2041"/>
+          </w:tcPr>
+          <w:p>
+            <w:r/>
+            <w:r>
+              <w:rPr>
+                <w:sz w:val="20"/>
+              </w:rPr>
+              <w:t>Sistema operativo de desarrollo</w:t>
+            </w:r>
+          </w:p>
+        </w:tc>
+        <w:tc>
+          <w:tcPr>
+            <w:tcW w:type="dxa" w:w="4195"/>
+          </w:tcPr>
+          <w:p>
+            <w:r/>
+            <w:r>
+              <w:rPr>
+                <w:sz w:val="20"/>
+              </w:rPr>
+              <w:t>Windows 10/11 de 64 bits (entorno de trabajo del equipo, con los scripts .bat de preparación del entorno) o macOS/Linux de 64 bits (scripts .sh)</w:t>
+            </w:r>
+          </w:p>
+        </w:tc>
+        <w:tc>
+          <w:tcPr>
+            <w:tcW w:type="dxa" w:w="2835"/>
+          </w:tcPr>
+          <w:p>
+            <w:r/>
+            <w:r>
+              <w:rPr>
+                <w:sz w:val="20"/>
+              </w:rPr>
+              <w:t>scripts/preparar_entorno.bat y scripts/preparar_entorno.sh</w:t>
+            </w:r>
+          </w:p>
+        </w:tc>
+      </w:tr>
+      <w:tr>
+        <w:trPr>
+          <w:cantSplit w:val="true"/>
+        </w:trPr>
+        <w:tc>
+          <w:tcPr>
+            <w:tcW w:type="dxa" w:w="2041"/>
+          </w:tcPr>
+          <w:p>
+            <w:r/>
+            <w:r>
+              <w:rPr>
+                <w:sz w:val="20"/>
+              </w:rPr>
+              <w:t>Procesador</w:t>
+            </w:r>
+          </w:p>
+        </w:tc>
+        <w:tc>
+          <w:tcPr>
+            <w:tcW w:type="dxa" w:w="4195"/>
+          </w:tcPr>
+          <w:p>
+            <w:r/>
+            <w:r>
+              <w:rPr>
+                <w:sz w:val="20"/>
+              </w:rPr>
+              <w:t>Mínimo 4 núcleos con virtualización activada; se recomienda un procesador de 8 núcleos o superior para la compilación en modo release</w:t>
+            </w:r>
+          </w:p>
+        </w:tc>
+        <w:tc>
+          <w:tcPr>
+            <w:tcW w:type="dxa" w:w="2835"/>
+          </w:tcPr>
+          <w:p>
+            <w:r/>
+            <w:r>
+              <w:rPr>
+                <w:sz w:val="20"/>
+              </w:rPr>
+              <w:t>Recomendación técnica del equipo, contrastada con los 333 s de compilación en el runner de CI</w:t>
+            </w:r>
+          </w:p>
+        </w:tc>
+      </w:tr>
+      <w:tr>
+        <w:trPr>
+          <w:cantSplit w:val="true"/>
+        </w:trPr>
+        <w:tc>
+          <w:tcPr>
+            <w:tcW w:type="dxa" w:w="2041"/>
+          </w:tcPr>
+          <w:p>
+            <w:r/>
+            <w:r>
+              <w:rPr>
+                <w:sz w:val="20"/>
+              </w:rPr>
+              <w:t>Memoria RAM</w:t>
+            </w:r>
+          </w:p>
+        </w:tc>
+        <w:tc>
+          <w:tcPr>
+            <w:tcW w:type="dxa" w:w="4195"/>
+          </w:tcPr>
+          <w:p>
+            <w:r/>
+            <w:r>
+              <w:rPr>
+                <w:sz w:val="20"/>
+              </w:rPr>
+              <w:t>Mínimo 8 GB; se recomienda 16 GB para evitar el uso de memoria de intercambio durante la compilación de Gradle</w:t>
+            </w:r>
+          </w:p>
+        </w:tc>
+        <w:tc>
+          <w:tcPr>
+            <w:tcW w:type="dxa" w:w="2835"/>
+          </w:tcPr>
+          <w:p>
+            <w:r/>
+            <w:r>
+              <w:rPr>
+                <w:sz w:val="20"/>
+              </w:rPr>
+              <w:t>Recomendación técnica del equipo</w:t>
+            </w:r>
+          </w:p>
+        </w:tc>
+      </w:tr>
+      <w:tr>
+        <w:trPr>
+          <w:cantSplit w:val="true"/>
+        </w:trPr>
+        <w:tc>
+          <w:tcPr>
+            <w:tcW w:type="dxa" w:w="2041"/>
+          </w:tcPr>
+          <w:p>
+            <w:r/>
+            <w:r>
+              <w:rPr>
+                <w:sz w:val="20"/>
+              </w:rPr>
+              <w:t>Almacenamiento</w:t>
+            </w:r>
+          </w:p>
+        </w:tc>
+        <w:tc>
+          <w:tcPr>
+            <w:tcW w:type="dxa" w:w="4195"/>
+          </w:tcPr>
+          <w:p>
+            <w:r/>
+            <w:r>
+              <w:rPr>
+                <w:sz w:val="20"/>
+              </w:rPr>
+              <w:t>Mínimo 10 GB libres para el SDK de Android, el SDK de Flutter, las dependencias de Gradle y el artefacto de compilación</w:t>
+            </w:r>
+          </w:p>
+        </w:tc>
+        <w:tc>
+          <w:tcPr>
+            <w:tcW w:type="dxa" w:w="2835"/>
+          </w:tcPr>
+          <w:p>
+            <w:r/>
+            <w:r>
+              <w:rPr>
+                <w:sz w:val="20"/>
+              </w:rPr>
+              <w:t>Verificado sobre el tamaño del artefacto publicado (55,2 MB) y el número de dependencias transitivas</w:t>
+            </w:r>
+          </w:p>
+        </w:tc>
+      </w:tr>
+      <w:tr>
+        <w:trPr>
+          <w:cantSplit w:val="true"/>
+        </w:trPr>
+        <w:tc>
+          <w:tcPr>
+            <w:tcW w:type="dxa" w:w="2041"/>
+          </w:tcPr>
+          <w:p>
+            <w:r/>
+            <w:r>
+              <w:rPr>
+                <w:sz w:val="20"/>
+              </w:rPr>
+              <w:t>Espacio en la nube de ejecución</w:t>
+            </w:r>
+          </w:p>
+        </w:tc>
+        <w:tc>
+          <w:tcPr>
+            <w:tcW w:type="dxa" w:w="4195"/>
+          </w:tcPr>
+          <w:p>
+            <w:r/>
+            <w:r>
+              <w:rPr>
+                <w:sz w:val="20"/>
+              </w:rPr>
+              <w:t>Proyecto de Supabase con al menos 8 tablas, la extensión pgcrypto habilitada y políticas RLS configuradas</w:t>
+            </w:r>
+          </w:p>
+        </w:tc>
+        <w:tc>
+          <w:tcPr>
+            <w:tcW w:type="dxa" w:w="2835"/>
+          </w:tcPr>
+          <w:p>
+            <w:r/>
+            <w:r>
+              <w:rPr>
+                <w:sz w:val="20"/>
+              </w:rPr>
+              <w:t>supabase/esquema.sql (171 líneas) y supabase/esquema_extra.sql (70 líneas)</w:t>
+            </w:r>
+          </w:p>
+        </w:tc>
+      </w:tr>
+      <w:tr>
+        <w:trPr>
+          <w:cantSplit w:val="true"/>
+        </w:trPr>
+        <w:tc>
+          <w:tcPr>
+            <w:tcW w:type="dxa" w:w="2041"/>
+          </w:tcPr>
+          <w:p>
+            <w:r/>
+            <w:r>
+              <w:rPr>
+                <w:sz w:val="20"/>
+              </w:rPr>
+              <w:t>Runner de integración continua</w:t>
+            </w:r>
+          </w:p>
+        </w:tc>
+        <w:tc>
+          <w:tcPr>
+            <w:tcW w:type="dxa" w:w="4195"/>
+          </w:tcPr>
+          <w:p>
+            <w:r/>
+            <w:r>
+              <w:rPr>
+                <w:sz w:val="20"/>
+              </w:rPr>
+              <w:t>Runner estándar hospedado por GitHub (4 vCPU, 16 GB de RAM y 14 GB de SSD) sobre la imagen ubuntu-latest</w:t>
+            </w:r>
+          </w:p>
+        </w:tc>
+        <w:tc>
+          <w:tcPr>
+            <w:tcW w:type="dxa" w:w="2835"/>
+          </w:tcPr>
+          <w:p>
+            <w:r/>
+            <w:r>
+              <w:rPr>
+                <w:sz w:val="20"/>
+              </w:rPr>
+              <w:t>Especificación del runner estándar hospedado por GitHub, utilizado en la ejecución verificada (Ubuntu 24.04.5)</w:t>
+            </w:r>
+          </w:p>
+        </w:tc>
+      </w:tr>
+      <w:tr>
+        <w:trPr>
+          <w:cantSplit w:val="true"/>
+        </w:trPr>
+        <w:tc>
+          <w:tcPr>
+            <w:tcW w:type="dxa" w:w="2041"/>
+          </w:tcPr>
+          <w:p>
+            <w:r/>
+            <w:r>
+              <w:rPr>
+                <w:sz w:val="20"/>
+              </w:rPr>
+              <w:t>Dispositivo cliente</w:t>
+            </w:r>
+          </w:p>
+        </w:tc>
+        <w:tc>
+          <w:tcPr>
+            <w:tcW w:type="dxa" w:w="4195"/>
+          </w:tcPr>
+          <w:p>
+            <w:r/>
+            <w:r>
+              <w:rPr>
+                <w:sz w:val="20"/>
+              </w:rPr>
+              <w:t>Teléfono o tablet con Android y conexión a Internet; la aplicación requiere únicamente permiso de red</w:t>
+            </w:r>
+          </w:p>
+        </w:tc>
+        <w:tc>
+          <w:tcPr>
+            <w:tcW w:type="dxa" w:w="2835"/>
+          </w:tcPr>
+          <w:p>
+            <w:r/>
+            <w:r>
+              <w:rPr>
+                <w:sz w:val="20"/>
+              </w:rPr>
+              <w:t>android/app/src/main/AndroidManifest.xml</w:t>
+            </w:r>
+          </w:p>
+        </w:tc>
+      </w:tr>
+    </w:tbl>
+    <w:p/>
+    <w:p>
+      <w:pPr>
+        <w:pStyle w:val="Heading2"/>
+      </w:pPr>
+      <w:r>
+        <w:rPr>
+          <w:color w:val="1E40AF"/>
+        </w:rPr>
+        <w:t>4.3 Software de desarrollo y versiones verificadas</w:t>
+      </w:r>
+    </w:p>
+    <w:p>
+      <w:r>
+        <w:rPr>
+          <w:b w:val="0"/>
+          <w:i w:val="0"/>
+          <w:sz w:val="24"/>
+        </w:rPr>
+        <w:t>La tabla siguiente detalla el toolchain completo exigido por el proyecto. Cada versión está fijada de forma explícita, lo que garantiza que el entorno de desarrollo y el entorno de integración continua sean equivalentes.</w:t>
+      </w:r>
+    </w:p>
+    <w:tbl>
+      <w:tblPr>
+        <w:tblStyle w:val="LightGrid-Accent1"/>
+        <w:tblW w:type="auto" w:w="0"/>
+        <w:jc w:val="center"/>
+        <w:tblLayout w:type="fixed"/>
+        <w:tblLook w:firstColumn="1" w:firstRow="1" w:lastColumn="0" w:lastRow="0" w:noHBand="0" w:noVBand="1" w:val="04A0"/>
+        <w:tblLayout w:type="fixed"/>
+      </w:tblPr>
+      <w:tblGrid>
+        <w:gridCol w:w="2351"/>
+        <w:gridCol w:w="2351"/>
+        <w:gridCol w:w="2351"/>
+        <w:gridCol w:w="2351"/>
+      </w:tblGrid>
+      <w:tr>
+        <w:trPr>
+          <w:tblHeader w:val="true"/>
+          <w:cantSplit w:val="true"/>
+        </w:trPr>
+        <w:tc>
+          <w:tcPr>
+            <w:tcW w:type="dxa" w:w="1928"/>
+          </w:tcPr>
+          <w:p>
+            <w:r/>
+            <w:r>
+              <w:rPr>
+                <w:b/>
+                <w:sz w:val="20"/>
+              </w:rPr>
+              <w:t>Componente</w:t>
+            </w:r>
+          </w:p>
+        </w:tc>
+        <w:tc>
+          <w:tcPr>
+            <w:tcW w:type="dxa" w:w="1587"/>
+          </w:tcPr>
+          <w:p>
+            <w:r/>
+            <w:r>
+              <w:rPr>
+                <w:b/>
+                <w:sz w:val="20"/>
+              </w:rPr>
+              <w:t>Versión fijada</w:t>
+            </w:r>
+          </w:p>
+        </w:tc>
+        <w:tc>
+          <w:tcPr>
+            <w:tcW w:type="dxa" w:w="3061"/>
+          </w:tcPr>
+          <w:p>
+            <w:r/>
+            <w:r>
+              <w:rPr>
+                <w:b/>
+                <w:sz w:val="20"/>
+              </w:rPr>
+              <w:t>Dónde se declara</w:t>
+            </w:r>
+          </w:p>
+        </w:tc>
+        <w:tc>
+          <w:tcPr>
+            <w:tcW w:type="dxa" w:w="2494"/>
+          </w:tcPr>
+          <w:p>
+            <w:r/>
+            <w:r>
+              <w:rPr>
+                <w:b/>
+                <w:sz w:val="20"/>
+              </w:rPr>
+              <w:t>Función en el proceso</w:t>
+            </w:r>
+          </w:p>
+        </w:tc>
+      </w:tr>
+      <w:tr>
+        <w:trPr>
+          <w:cantSplit w:val="true"/>
+        </w:trPr>
+        <w:tc>
+          <w:tcPr>
+            <w:tcW w:type="dxa" w:w="1928"/>
+          </w:tcPr>
+          <w:p>
+            <w:r/>
+            <w:r>
+              <w:rPr>
+                <w:sz w:val="20"/>
+              </w:rPr>
+              <w:t>Flutter SDK</w:t>
+            </w:r>
+          </w:p>
+        </w:tc>
+        <w:tc>
+          <w:tcPr>
+            <w:tcW w:type="dxa" w:w="1587"/>
+          </w:tcPr>
+          <w:p>
+            <w:r/>
+            <w:r>
+              <w:rPr>
+                <w:sz w:val="20"/>
+              </w:rPr>
+              <w:t>3.47.5 (canal stable)</w:t>
+            </w:r>
+          </w:p>
+        </w:tc>
+        <w:tc>
+          <w:tcPr>
+            <w:tcW w:type="dxa" w:w="3061"/>
+          </w:tcPr>
+          <w:p>
+            <w:r/>
+            <w:r>
+              <w:rPr>
+                <w:sz w:val="20"/>
+              </w:rPr>
+              <w:t>.github/workflows/ci-cd.yml (env FLUTTER_VERSION)</w:t>
+            </w:r>
+          </w:p>
+        </w:tc>
+        <w:tc>
+          <w:tcPr>
+            <w:tcW w:type="dxa" w:w="2494"/>
+          </w:tcPr>
+          <w:p>
+            <w:r/>
+            <w:r>
+              <w:rPr>
+                <w:sz w:val="20"/>
+              </w:rPr>
+              <w:t>Compilación del APK, análisis estático y ejecución de pruebas</w:t>
+            </w:r>
+          </w:p>
+        </w:tc>
+      </w:tr>
+      <w:tr>
+        <w:trPr>
+          <w:cantSplit w:val="true"/>
+        </w:trPr>
+        <w:tc>
+          <w:tcPr>
+            <w:tcW w:type="dxa" w:w="1928"/>
+          </w:tcPr>
+          <w:p>
+            <w:r/>
+            <w:r>
+              <w:rPr>
+                <w:sz w:val="20"/>
+              </w:rPr>
+              <w:t>Dart SDK</w:t>
+            </w:r>
+          </w:p>
+        </w:tc>
+        <w:tc>
+          <w:tcPr>
+            <w:tcW w:type="dxa" w:w="1587"/>
+          </w:tcPr>
+          <w:p>
+            <w:r/>
+            <w:r>
+              <w:rPr>
+                <w:sz w:val="20"/>
+              </w:rPr>
+              <w:t>^3.13.4</w:t>
+            </w:r>
+          </w:p>
+        </w:tc>
+        <w:tc>
+          <w:tcPr>
+            <w:tcW w:type="dxa" w:w="3061"/>
+          </w:tcPr>
+          <w:p>
+            <w:r/>
+            <w:r>
+              <w:rPr>
+                <w:sz w:val="20"/>
+              </w:rPr>
+              <w:t>pubspec.yaml (environment.sdk)</w:t>
+            </w:r>
+          </w:p>
+        </w:tc>
+        <w:tc>
+          <w:tcPr>
+            <w:tcW w:type="dxa" w:w="2494"/>
+          </w:tcPr>
+          <w:p>
+            <w:r/>
+            <w:r>
+              <w:rPr>
+                <w:sz w:val="20"/>
+              </w:rPr>
+              <w:t>Lenguaje de la aplicación; restricción de compatibilidad del código</w:t>
+            </w:r>
+          </w:p>
+        </w:tc>
+      </w:tr>
+      <w:tr>
+        <w:trPr>
+          <w:cantSplit w:val="true"/>
+        </w:trPr>
+        <w:tc>
+          <w:tcPr>
+            <w:tcW w:type="dxa" w:w="1928"/>
+          </w:tcPr>
+          <w:p>
+            <w:r/>
+            <w:r>
+              <w:rPr>
+                <w:sz w:val="20"/>
+              </w:rPr>
+              <w:t>Java (JDK Temurin)</w:t>
+            </w:r>
+          </w:p>
+        </w:tc>
+        <w:tc>
+          <w:tcPr>
+            <w:tcW w:type="dxa" w:w="1587"/>
+          </w:tcPr>
+          <w:p>
+            <w:r/>
+            <w:r>
+              <w:rPr>
+                <w:sz w:val="20"/>
+              </w:rPr>
+              <w:t>17</w:t>
+            </w:r>
+          </w:p>
+        </w:tc>
+        <w:tc>
+          <w:tcPr>
+            <w:tcW w:type="dxa" w:w="3061"/>
+          </w:tcPr>
+          <w:p>
+            <w:r/>
+            <w:r>
+              <w:rPr>
+                <w:sz w:val="20"/>
+              </w:rPr>
+              <w:t>ci-cd.yml (env JAVA_VERSION) y android/app/build.gradle.kts</w:t>
+            </w:r>
+          </w:p>
+        </w:tc>
+        <w:tc>
+          <w:tcPr>
+            <w:tcW w:type="dxa" w:w="2494"/>
+          </w:tcPr>
+          <w:p>
+            <w:r/>
+            <w:r>
+              <w:rPr>
+                <w:sz w:val="20"/>
+              </w:rPr>
+              <w:t>Ejecución de Gradle y del compilador de Android</w:t>
+            </w:r>
+          </w:p>
+        </w:tc>
+      </w:tr>
+      <w:tr>
+        <w:trPr>
+          <w:cantSplit w:val="true"/>
+        </w:trPr>
+        <w:tc>
+          <w:tcPr>
+            <w:tcW w:type="dxa" w:w="1928"/>
+          </w:tcPr>
+          <w:p>
+            <w:r/>
+            <w:r>
+              <w:rPr>
+                <w:sz w:val="20"/>
+              </w:rPr>
+              <w:t>Node.js</w:t>
+            </w:r>
+          </w:p>
+        </w:tc>
+        <w:tc>
+          <w:tcPr>
+            <w:tcW w:type="dxa" w:w="1587"/>
+          </w:tcPr>
+          <w:p>
+            <w:r/>
+            <w:r>
+              <w:rPr>
+                <w:sz w:val="20"/>
+              </w:rPr>
+              <w:t>20</w:t>
+            </w:r>
+          </w:p>
+        </w:tc>
+        <w:tc>
+          <w:tcPr>
+            <w:tcW w:type="dxa" w:w="3061"/>
+          </w:tcPr>
+          <w:p>
+            <w:r/>
+            <w:r>
+              <w:rPr>
+                <w:sz w:val="20"/>
+              </w:rPr>
+              <w:t>ci-cd.yml (env NODE_VERSION)</w:t>
+            </w:r>
+          </w:p>
+        </w:tc>
+        <w:tc>
+          <w:tcPr>
+            <w:tcW w:type="dxa" w:w="2494"/>
+          </w:tcPr>
+          <w:p>
+            <w:r/>
+            <w:r>
+              <w:rPr>
+                <w:sz w:val="20"/>
+              </w:rPr>
+              <w:t>Ejecución de Newman para las pruebas de contrato de la API</w:t>
+            </w:r>
+          </w:p>
+        </w:tc>
+      </w:tr>
+      <w:tr>
+        <w:trPr>
+          <w:cantSplit w:val="true"/>
+        </w:trPr>
+        <w:tc>
+          <w:tcPr>
+            <w:tcW w:type="dxa" w:w="1928"/>
+          </w:tcPr>
+          <w:p>
+            <w:r/>
+            <w:r>
+              <w:rPr>
+                <w:sz w:val="20"/>
+              </w:rPr>
+              <w:t>Gradle</w:t>
+            </w:r>
+          </w:p>
+        </w:tc>
+        <w:tc>
+          <w:tcPr>
+            <w:tcW w:type="dxa" w:w="1587"/>
+          </w:tcPr>
+          <w:p>
+            <w:r/>
+            <w:r>
+              <w:rPr>
+                <w:sz w:val="20"/>
+              </w:rPr>
+              <w:t>9.3.1</w:t>
+            </w:r>
+          </w:p>
+        </w:tc>
+        <w:tc>
+          <w:tcPr>
+            <w:tcW w:type="dxa" w:w="3061"/>
+          </w:tcPr>
+          <w:p>
+            <w:r/>
+            <w:r>
+              <w:rPr>
+                <w:sz w:val="20"/>
+              </w:rPr>
+              <w:t>android/gradle/wrapper/gradle-wrapper.properties</w:t>
+            </w:r>
+          </w:p>
+        </w:tc>
+        <w:tc>
+          <w:tcPr>
+            <w:tcW w:type="dxa" w:w="2494"/>
+          </w:tcPr>
+          <w:p>
+            <w:r/>
+            <w:r>
+              <w:rPr>
+                <w:sz w:val="20"/>
+              </w:rPr>
+              <w:t>Sistema de construcción de Android</w:t>
+            </w:r>
+          </w:p>
+        </w:tc>
+      </w:tr>
+      <w:tr>
+        <w:trPr>
+          <w:cantSplit w:val="true"/>
+        </w:trPr>
+        <w:tc>
+          <w:tcPr>
+            <w:tcW w:type="dxa" w:w="1928"/>
+          </w:tcPr>
+          <w:p>
+            <w:r/>
+            <w:r>
+              <w:rPr>
+                <w:sz w:val="20"/>
+              </w:rPr>
+              <w:t>Android Gradle Plugin</w:t>
+            </w:r>
+          </w:p>
+        </w:tc>
+        <w:tc>
+          <w:tcPr>
+            <w:tcW w:type="dxa" w:w="1587"/>
+          </w:tcPr>
+          <w:p>
+            <w:r/>
+            <w:r>
+              <w:rPr>
+                <w:sz w:val="20"/>
+              </w:rPr>
+              <w:t>9.1.0</w:t>
+            </w:r>
+          </w:p>
+        </w:tc>
+        <w:tc>
+          <w:tcPr>
+            <w:tcW w:type="dxa" w:w="3061"/>
+          </w:tcPr>
+          <w:p>
+            <w:r/>
+            <w:r>
+              <w:rPr>
+                <w:sz w:val="20"/>
+              </w:rPr>
+              <w:t>android/settings.gradle.kts</w:t>
+            </w:r>
+          </w:p>
+        </w:tc>
+        <w:tc>
+          <w:tcPr>
+            <w:tcW w:type="dxa" w:w="2494"/>
+          </w:tcPr>
+          <w:p>
+            <w:r/>
+            <w:r>
+              <w:rPr>
+                <w:sz w:val="20"/>
+              </w:rPr>
+              <w:t>Complemento de construcción de Android</w:t>
+            </w:r>
+          </w:p>
+        </w:tc>
+      </w:tr>
+      <w:tr>
+        <w:trPr>
+          <w:cantSplit w:val="true"/>
+        </w:trPr>
+        <w:tc>
+          <w:tcPr>
+            <w:tcW w:type="dxa" w:w="1928"/>
+          </w:tcPr>
+          <w:p>
+            <w:r/>
+            <w:r>
+              <w:rPr>
+                <w:sz w:val="20"/>
+              </w:rPr>
+              <w:t>Kotlin</w:t>
+            </w:r>
+          </w:p>
+        </w:tc>
+        <w:tc>
+          <w:tcPr>
+            <w:tcW w:type="dxa" w:w="1587"/>
+          </w:tcPr>
+          <w:p>
+            <w:r/>
+            <w:r>
+              <w:rPr>
+                <w:sz w:val="20"/>
+              </w:rPr>
+              <w:t>2.4.0</w:t>
+            </w:r>
+          </w:p>
+        </w:tc>
+        <w:tc>
+          <w:tcPr>
+            <w:tcW w:type="dxa" w:w="3061"/>
+          </w:tcPr>
+          <w:p>
+            <w:r/>
+            <w:r>
+              <w:rPr>
+                <w:sz w:val="20"/>
+              </w:rPr>
+              <w:t>android/settings.gradle.kts</w:t>
+            </w:r>
+          </w:p>
+        </w:tc>
+        <w:tc>
+          <w:tcPr>
+            <w:tcW w:type="dxa" w:w="2494"/>
+          </w:tcPr>
+          <w:p>
+            <w:r/>
+            <w:r>
+              <w:rPr>
+                <w:sz w:val="20"/>
+              </w:rPr>
+              <w:t>Compilación del código Kotlin de la aplicación</w:t>
+            </w:r>
+          </w:p>
+        </w:tc>
+      </w:tr>
+      <w:tr>
+        <w:trPr>
+          <w:cantSplit w:val="true"/>
+        </w:trPr>
+        <w:tc>
+          <w:tcPr>
+            <w:tcW w:type="dxa" w:w="1928"/>
+          </w:tcPr>
+          <w:p>
+            <w:r/>
+            <w:r>
+              <w:rPr>
+                <w:sz w:val="20"/>
+              </w:rPr>
+              <w:t>Android NDK</w:t>
+            </w:r>
+          </w:p>
+        </w:tc>
+        <w:tc>
+          <w:tcPr>
+            <w:tcW w:type="dxa" w:w="1587"/>
+          </w:tcPr>
+          <w:p>
+            <w:r/>
+            <w:r>
+              <w:rPr>
+                <w:sz w:val="20"/>
+              </w:rPr>
+              <w:t>28.2.13676358</w:t>
+            </w:r>
+          </w:p>
+        </w:tc>
+        <w:tc>
+          <w:tcPr>
+            <w:tcW w:type="dxa" w:w="3061"/>
+          </w:tcPr>
+          <w:p>
+            <w:r/>
+            <w:r>
+              <w:rPr>
+                <w:sz w:val="20"/>
+              </w:rPr>
+              <w:t>android/app/build.gradle.kts</w:t>
+            </w:r>
+          </w:p>
+        </w:tc>
+        <w:tc>
+          <w:tcPr>
+            <w:tcW w:type="dxa" w:w="2494"/>
+          </w:tcPr>
+          <w:p>
+            <w:r/>
+            <w:r>
+              <w:rPr>
+                <w:sz w:val="20"/>
+              </w:rPr>
+              <w:t>Bibliotecas nativas del motor Flutter</w:t>
+            </w:r>
+          </w:p>
+        </w:tc>
+      </w:tr>
+      <w:tr>
+        <w:trPr>
+          <w:cantSplit w:val="true"/>
+        </w:trPr>
+        <w:tc>
+          <w:tcPr>
+            <w:tcW w:type="dxa" w:w="1928"/>
+          </w:tcPr>
+          <w:p>
+            <w:r/>
+            <w:r>
+              <w:rPr>
+                <w:sz w:val="20"/>
+              </w:rPr>
+              <w:t>Git</w:t>
+            </w:r>
+          </w:p>
+        </w:tc>
+        <w:tc>
+          <w:tcPr>
+            <w:tcW w:type="dxa" w:w="1587"/>
+          </w:tcPr>
+          <w:p>
+            <w:r/>
+            <w:r>
+              <w:rPr>
+                <w:sz w:val="20"/>
+              </w:rPr>
+              <w:t>Última versión estable</w:t>
+            </w:r>
+          </w:p>
+        </w:tc>
+        <w:tc>
+          <w:tcPr>
+            <w:tcW w:type="dxa" w:w="3061"/>
+          </w:tcPr>
+          <w:p>
+            <w:r/>
+            <w:r>
+              <w:rPr>
+                <w:sz w:val="20"/>
+              </w:rPr>
+              <w:t>Verificado por el paso 1/5 de scripts/preparar_entorno.sh y .bat</w:t>
+            </w:r>
+          </w:p>
+        </w:tc>
+        <w:tc>
+          <w:tcPr>
+            <w:tcW w:type="dxa" w:w="2494"/>
+          </w:tcPr>
+          <w:p>
+            <w:r/>
+            <w:r>
+              <w:rPr>
+                <w:sz w:val="20"/>
+              </w:rPr>
+              <w:t>Control de versiones e integración del código</w:t>
+            </w:r>
+          </w:p>
+        </w:tc>
+      </w:tr>
+      <w:tr>
+        <w:trPr>
+          <w:cantSplit w:val="true"/>
+        </w:trPr>
+        <w:tc>
+          <w:tcPr>
+            <w:tcW w:type="dxa" w:w="1928"/>
+          </w:tcPr>
+          <w:p>
+            <w:r/>
+            <w:r>
+              <w:rPr>
+                <w:sz w:val="20"/>
+              </w:rPr>
+              <w:t>Newman</w:t>
+            </w:r>
+          </w:p>
+        </w:tc>
+        <w:tc>
+          <w:tcPr>
+            <w:tcW w:type="dxa" w:w="1587"/>
+          </w:tcPr>
+          <w:p>
+            <w:r/>
+            <w:r>
+              <w:rPr>
+                <w:sz w:val="20"/>
+              </w:rPr>
+              <w:t>6.2.3</w:t>
+            </w:r>
+          </w:p>
+        </w:tc>
+        <w:tc>
+          <w:tcPr>
+            <w:tcW w:type="dxa" w:w="3061"/>
+          </w:tcPr>
+          <w:p>
+            <w:r/>
+            <w:r>
+              <w:rPr>
+                <w:sz w:val="20"/>
+              </w:rPr>
+              <w:t>Instalado en la etapa «api» con npm (npm install -g newman newman-reporter-htmlextra)</w:t>
+            </w:r>
+          </w:p>
+        </w:tc>
+        <w:tc>
+          <w:tcPr>
+            <w:tcW w:type="dxa" w:w="2494"/>
+          </w:tcPr>
+          <w:p>
+            <w:r/>
+            <w:r>
+              <w:rPr>
+                <w:sz w:val="20"/>
+              </w:rPr>
+              <w:t>Ejecución automatizada de la colección de pruebas de la API</w:t>
+            </w:r>
+          </w:p>
+        </w:tc>
+      </w:tr>
+      <w:tr>
+        <w:trPr>
+          <w:cantSplit w:val="true"/>
+        </w:trPr>
+        <w:tc>
+          <w:tcPr>
+            <w:tcW w:type="dxa" w:w="1928"/>
+          </w:tcPr>
+          <w:p>
+            <w:r/>
+            <w:r>
+              <w:rPr>
+                <w:sz w:val="20"/>
+              </w:rPr>
+              <w:t>Reglas de calidad de código</w:t>
+            </w:r>
+          </w:p>
+        </w:tc>
+        <w:tc>
+          <w:tcPr>
+            <w:tcW w:type="dxa" w:w="1587"/>
+          </w:tcPr>
+          <w:p>
+            <w:r/>
+            <w:r>
+              <w:rPr>
+                <w:sz w:val="20"/>
+              </w:rPr>
+              <w:t>flutter_lints 6.0.0</w:t>
+            </w:r>
+          </w:p>
+        </w:tc>
+        <w:tc>
+          <w:tcPr>
+            <w:tcW w:type="dxa" w:w="3061"/>
+          </w:tcPr>
+          <w:p>
+            <w:r/>
+            <w:r>
+              <w:rPr>
+                <w:sz w:val="20"/>
+              </w:rPr>
+              <w:t>analysis_options.yaml (include: package:flutter_lints/flutter.yaml)</w:t>
+            </w:r>
+          </w:p>
+        </w:tc>
+        <w:tc>
+          <w:tcPr>
+            <w:tcW w:type="dxa" w:w="2494"/>
+          </w:tcPr>
+          <w:p>
+            <w:r/>
+            <w:r>
+              <w:rPr>
+                <w:sz w:val="20"/>
+              </w:rPr>
+              <w:t>Conjunto de reglas de análisis estático aplicado a todo el proyecto</w:t>
+            </w:r>
+          </w:p>
+        </w:tc>
+      </w:tr>
+    </w:tbl>
+    <w:p/>
+    <w:p>
+      <w:r>
+        <w:rPr>
+          <w:b w:val="0"/>
+          <w:i w:val="0"/>
+          <w:sz w:val="24"/>
+        </w:rPr>
+        <w:t>Las dependencias de la aplicación están declaradas en pubspec.yaml: supabase_flutter 2.18.3 (cliente de la API y del servicio de autenticación), provider 6.1.5+1 (gestión de estado), intl 0.20.3 (formato de fechas y cifras) y cupertino_icons 1.0.8. Como dependencias de desarrollo se incluyen flutter_test y flutter_lints. El archivo pubspec.lock, versionado en el repositorio, fija las versiones transitivas exactas, de modo que una instalación reproducible se obtiene con flutter pub get sobre ese archivo.</w:t>
+      </w:r>
+    </w:p>
+    <w:p>
+      <w:pPr>
+        <w:pStyle w:val="Heading2"/>
+      </w:pPr>
+      <w:r>
+        <w:rPr>
+          <w:color w:val="1E40AF"/>
+        </w:rPr>
+        <w:t>4.4 Entorno de integración continua</w:t>
+      </w:r>
+    </w:p>
+    <w:p>
+      <w:r>
+        <w:rPr>
+          <w:b w:val="0"/>
+          <w:i w:val="0"/>
+          <w:sz w:val="24"/>
+        </w:rPr>
+        <w:t>El entorno de integración continua es una imagen controlada y desechable: cada ejecución parte de una imagen limpia, resuelve las dependencias desde cero y termina destruyendo el runner. Esta condición elimina el estado residual entre ejecuciones y es la base de la reproducibilidad del proceso.</w:t>
+      </w:r>
+    </w:p>
+    <w:tbl>
+      <w:tblPr>
+        <w:tblStyle w:val="LightGrid-Accent1"/>
+        <w:tblW w:type="auto" w:w="0"/>
+        <w:jc w:val="center"/>
+        <w:tblLayout w:type="fixed"/>
+        <w:tblLook w:firstColumn="1" w:firstRow="1" w:lastColumn="0" w:lastRow="0" w:noHBand="0" w:noVBand="1" w:val="04A0"/>
+        <w:tblLayout w:type="fixed"/>
+      </w:tblPr>
+      <w:tblGrid>
+        <w:gridCol w:w="4703"/>
+        <w:gridCol w:w="4703"/>
+      </w:tblGrid>
+      <w:tr>
+        <w:trPr>
+          <w:tblHeader w:val="true"/>
+          <w:cantSplit w:val="true"/>
+        </w:trPr>
+        <w:tc>
+          <w:tcPr>
+            <w:tcW w:type="dxa" w:w="2835"/>
+          </w:tcPr>
+          <w:p>
+            <w:r/>
+            <w:r>
+              <w:rPr>
+                <w:b/>
+                <w:sz w:val="20"/>
+              </w:rPr>
+              <w:t>Elemento del entorno de CI</w:t>
+            </w:r>
+          </w:p>
+        </w:tc>
+        <w:tc>
+          <w:tcPr>
+            <w:tcW w:type="dxa" w:w="6236"/>
+          </w:tcPr>
+          <w:p>
+            <w:r/>
+            <w:r>
+              <w:rPr>
+                <w:b/>
+                <w:sz w:val="20"/>
+              </w:rPr>
+              <w:t>Configuración verificada</w:t>
+            </w:r>
+          </w:p>
+        </w:tc>
+      </w:tr>
+      <w:tr>
+        <w:trPr>
+          <w:cantSplit w:val="true"/>
+        </w:trPr>
+        <w:tc>
+          <w:tcPr>
+            <w:tcW w:type="dxa" w:w="2835"/>
+          </w:tcPr>
+          <w:p>
+            <w:r/>
+            <w:r>
+              <w:rPr>
+                <w:sz w:val="20"/>
+              </w:rPr>
+              <w:t>Imagen del runner</w:t>
+            </w:r>
+          </w:p>
+        </w:tc>
+        <w:tc>
+          <w:tcPr>
+            <w:tcW w:type="dxa" w:w="6236"/>
+          </w:tcPr>
+          <w:p>
+            <w:r/>
+            <w:r>
+              <w:rPr>
+                <w:sz w:val="20"/>
+              </w:rPr>
+              <w:t>ubuntu-latest (Ubuntu 24.04.5 LTS en las ejecuciones verificadas)</w:t>
+            </w:r>
+          </w:p>
+        </w:tc>
+      </w:tr>
+      <w:tr>
+        <w:trPr>
+          <w:cantSplit w:val="true"/>
+        </w:trPr>
+        <w:tc>
+          <w:tcPr>
+            <w:tcW w:type="dxa" w:w="2835"/>
+          </w:tcPr>
+          <w:p>
+            <w:r/>
+            <w:r>
+              <w:rPr>
+                <w:sz w:val="20"/>
+              </w:rPr>
+              <w:t>Variables de entorno de la ejecución</w:t>
+            </w:r>
+          </w:p>
+        </w:tc>
+        <w:tc>
+          <w:tcPr>
+            <w:tcW w:type="dxa" w:w="6236"/>
+          </w:tcPr>
+          <w:p>
+            <w:r/>
+            <w:r>
+              <w:rPr>
+                <w:sz w:val="20"/>
+              </w:rPr>
+              <w:t>FLUTTER_VERSION=3.47.5, JAVA_VERSION=17, NODE_VERSION=20</w:t>
+            </w:r>
+          </w:p>
+        </w:tc>
+      </w:tr>
+      <w:tr>
+        <w:trPr>
+          <w:cantSplit w:val="true"/>
+        </w:trPr>
+        <w:tc>
+          <w:tcPr>
+            <w:tcW w:type="dxa" w:w="2835"/>
+          </w:tcPr>
+          <w:p>
+            <w:r/>
+            <w:r>
+              <w:rPr>
+                <w:sz w:val="20"/>
+              </w:rPr>
+              <w:t>Acciones de preparación</w:t>
+            </w:r>
+          </w:p>
+        </w:tc>
+        <w:tc>
+          <w:tcPr>
+            <w:tcW w:type="dxa" w:w="6236"/>
+          </w:tcPr>
+          <w:p>
+            <w:r/>
+            <w:r>
+              <w:rPr>
+                <w:sz w:val="20"/>
+              </w:rPr>
+              <w:t>actions/checkout@v4, actions/setup-java@v4 (distribución temurin), subosito/flutter-action@v2 (canal stable, caché habilitada), actions/setup-node@v4</w:t>
+            </w:r>
+          </w:p>
+        </w:tc>
+      </w:tr>
+      <w:tr>
+        <w:trPr>
+          <w:cantSplit w:val="true"/>
+        </w:trPr>
+        <w:tc>
+          <w:tcPr>
+            <w:tcW w:type="dxa" w:w="2835"/>
+          </w:tcPr>
+          <w:p>
+            <w:r/>
+            <w:r>
+              <w:rPr>
+                <w:sz w:val="20"/>
+              </w:rPr>
+              <w:t>Acciones de publicación</w:t>
+            </w:r>
+          </w:p>
+        </w:tc>
+        <w:tc>
+          <w:tcPr>
+            <w:tcW w:type="dxa" w:w="6236"/>
+          </w:tcPr>
+          <w:p>
+            <w:r/>
+            <w:r>
+              <w:rPr>
+                <w:sz w:val="20"/>
+              </w:rPr>
+              <w:t>actions/upload-artifact@v4 (artefactos pub-deps, cobertura, reporte-api y fitcore-apk) y softprops/action-gh-release para la Release</w:t>
+            </w:r>
+          </w:p>
+        </w:tc>
+      </w:tr>
+      <w:tr>
+        <w:trPr>
+          <w:cantSplit w:val="true"/>
+        </w:trPr>
+        <w:tc>
+          <w:tcPr>
+            <w:tcW w:type="dxa" w:w="2835"/>
+          </w:tcPr>
+          <w:p>
+            <w:r/>
+            <w:r>
+              <w:rPr>
+                <w:sz w:val="20"/>
+              </w:rPr>
+              <w:t>Sistema de versiones</w:t>
+            </w:r>
+          </w:p>
+        </w:tc>
+        <w:tc>
+          <w:tcPr>
+            <w:tcW w:type="dxa" w:w="6236"/>
+          </w:tcPr>
+          <w:p>
+            <w:r/>
+            <w:r>
+              <w:rPr>
+                <w:sz w:val="20"/>
+              </w:rPr>
+              <w:t>El repositorio y el historial de releases de GitHub, con la etiqueta v1.0.0+&lt;build&gt; por publicación</w:t>
+            </w:r>
+          </w:p>
+        </w:tc>
+      </w:tr>
+      <w:tr>
+        <w:trPr>
+          <w:cantSplit w:val="true"/>
+        </w:trPr>
+        <w:tc>
+          <w:tcPr>
+            <w:tcW w:type="dxa" w:w="2835"/>
+          </w:tcPr>
+          <w:p>
+            <w:r/>
+            <w:r>
+              <w:rPr>
+                <w:sz w:val="20"/>
+              </w:rPr>
+              <w:t>Secretos disponibles para las etapas</w:t>
+            </w:r>
+          </w:p>
+        </w:tc>
+        <w:tc>
+          <w:tcPr>
+            <w:tcW w:type="dxa" w:w="6236"/>
+          </w:tcPr>
+          <w:p>
+            <w:r/>
+            <w:r>
+              <w:rPr>
+                <w:sz w:val="20"/>
+              </w:rPr>
+              <w:t>SUPABASE_URL, SUPABASE_ANON_KEY (etapas «api» y «construye»), FITCORE_TEST_EMAIL y FITCORE_TEST_PASSWORD (etapa «api»)</w:t>
+            </w:r>
+          </w:p>
+        </w:tc>
+      </w:tr>
+      <w:tr>
+        <w:trPr>
+          <w:cantSplit w:val="true"/>
+        </w:trPr>
+        <w:tc>
+          <w:tcPr>
+            <w:tcW w:type="dxa" w:w="2835"/>
+          </w:tcPr>
+          <w:p>
+            <w:r/>
+            <w:r>
+              <w:rPr>
+                <w:sz w:val="20"/>
+              </w:rPr>
+              <w:t>Cacheo</w:t>
+            </w:r>
+          </w:p>
+        </w:tc>
+        <w:tc>
+          <w:tcPr>
+            <w:tcW w:type="dxa" w:w="6236"/>
+          </w:tcPr>
+          <w:p>
+            <w:r/>
+            <w:r>
+              <w:rPr>
+                <w:sz w:val="20"/>
+              </w:rPr>
+              <w:t>Caché de Flutter habilitada en la acción de instalación, con lo que la etapa de preparación resuelve dependencias en 34 s</w:t>
+            </w:r>
+          </w:p>
+        </w:tc>
+      </w:tr>
+      <w:tr>
+        <w:trPr>
+          <w:cantSplit w:val="true"/>
+        </w:trPr>
+        <w:tc>
+          <w:tcPr>
+            <w:tcW w:type="dxa" w:w="2835"/>
+          </w:tcPr>
+          <w:p>
+            <w:r/>
+            <w:r>
+              <w:rPr>
+                <w:sz w:val="20"/>
+              </w:rPr>
+              <w:t>Aislamiento</w:t>
+            </w:r>
+          </w:p>
+        </w:tc>
+        <w:tc>
+          <w:tcPr>
+            <w:tcW w:type="dxa" w:w="6236"/>
+          </w:tcPr>
+          <w:p>
+            <w:r/>
+            <w:r>
+              <w:rPr>
+                <w:sz w:val="20"/>
+              </w:rPr>
+              <w:t>Cada job ejecuta en su propio runner; el artefacto pub-deps (pubspec.lock y .dart_tool/package_config.json) es el único punto de intercambio entre la etapa de entorno y las etapas de validación</w:t>
+            </w:r>
+          </w:p>
+        </w:tc>
+      </w:tr>
+    </w:tbl>
+    <w:p/>
+    <w:p>
+      <w:pPr>
+        <w:pStyle w:val="Heading2"/>
+      </w:pPr>
+      <w:r>
+        <w:rPr>
+          <w:color w:val="1E40AF"/>
+        </w:rPr>
+        <w:t>4.5 Entorno de servicios en la nube (Supabase)</w:t>
+      </w:r>
+    </w:p>
+    <w:p>
+      <w:r>
+        <w:rPr>
+          <w:b w:val="0"/>
+          <w:i w:val="0"/>
+          <w:sz w:val="24"/>
+        </w:rPr>
+        <w:t>El backend de FitCore no es un servidor propio sino un servicio gestionado en la nube, cuyo proyecto se identifica por la URL https://zxsberoadrixfenzddig.supabase.co. Este modelo elimina la tarea de administrar servidores, bases de datos y certificados, y concentra el esfuerzo del equipo en la aplicación y en su contrato de datos.</w:t>
+      </w:r>
+    </w:p>
+    <w:tbl>
+      <w:tblPr>
+        <w:tblStyle w:val="LightGrid-Accent1"/>
+        <w:tblW w:type="auto" w:w="0"/>
+        <w:jc w:val="center"/>
+        <w:tblLayout w:type="fixed"/>
+        <w:tblLook w:firstColumn="1" w:firstRow="1" w:lastColumn="0" w:lastRow="0" w:noHBand="0" w:noVBand="1" w:val="04A0"/>
+        <w:tblLayout w:type="fixed"/>
+      </w:tblPr>
+      <w:tblGrid>
+        <w:gridCol w:w="3135"/>
+        <w:gridCol w:w="3135"/>
+        <w:gridCol w:w="3135"/>
+      </w:tblGrid>
+      <w:tr>
+        <w:trPr>
+          <w:tblHeader w:val="true"/>
+          <w:cantSplit w:val="true"/>
+        </w:trPr>
+        <w:tc>
+          <w:tcPr>
+            <w:tcW w:type="dxa" w:w="2154"/>
+          </w:tcPr>
+          <w:p>
+            <w:r/>
+            <w:r>
+              <w:rPr>
+                <w:b/>
+                <w:sz w:val="20"/>
+              </w:rPr>
+              <w:t>Componente del servicio</w:t>
+            </w:r>
+          </w:p>
+        </w:tc>
+        <w:tc>
+          <w:tcPr>
+            <w:tcW w:type="dxa" w:w="3969"/>
+          </w:tcPr>
+          <w:p>
+            <w:r/>
+            <w:r>
+              <w:rPr>
+                <w:b/>
+                <w:sz w:val="20"/>
+              </w:rPr>
+              <w:t>Función en FitCore</w:t>
+            </w:r>
+          </w:p>
+        </w:tc>
+        <w:tc>
+          <w:tcPr>
+            <w:tcW w:type="dxa" w:w="2948"/>
+          </w:tcPr>
+          <w:p>
+            <w:r/>
+            <w:r>
+              <w:rPr>
+                <w:b/>
+                <w:sz w:val="20"/>
+              </w:rPr>
+              <w:t>Verificación</w:t>
+            </w:r>
+          </w:p>
+        </w:tc>
+      </w:tr>
+      <w:tr>
+        <w:trPr>
+          <w:cantSplit w:val="true"/>
+        </w:trPr>
+        <w:tc>
+          <w:tcPr>
+            <w:tcW w:type="dxa" w:w="2154"/>
+          </w:tcPr>
+          <w:p>
+            <w:r/>
+            <w:r>
+              <w:rPr>
+                <w:sz w:val="20"/>
+              </w:rPr>
+              <w:t>PostgreSQL gestionado</w:t>
+            </w:r>
+          </w:p>
+        </w:tc>
+        <w:tc>
+          <w:tcPr>
+            <w:tcW w:type="dxa" w:w="3969"/>
+          </w:tcPr>
+          <w:p>
+            <w:r/>
+            <w:r>
+              <w:rPr>
+                <w:sz w:val="20"/>
+              </w:rPr>
+              <w:t>Almacena las 8 tablas de negocio: usuarios, clases, rutinas, membresías, pagos, avisos, planes e info_gimnasio</w:t>
+            </w:r>
+          </w:p>
+        </w:tc>
+        <w:tc>
+          <w:tcPr>
+            <w:tcW w:type="dxa" w:w="2948"/>
+          </w:tcPr>
+          <w:p>
+            <w:r/>
+            <w:r>
+              <w:rPr>
+                <w:sz w:val="20"/>
+              </w:rPr>
+              <w:t>supabase/esquema.sql y supabase/esquema_extra.sql</w:t>
+            </w:r>
+          </w:p>
+        </w:tc>
+      </w:tr>
+      <w:tr>
+        <w:trPr>
+          <w:cantSplit w:val="true"/>
+        </w:trPr>
+        <w:tc>
+          <w:tcPr>
+            <w:tcW w:type="dxa" w:w="2154"/>
+          </w:tcPr>
+          <w:p>
+            <w:r/>
+            <w:r>
+              <w:rPr>
+                <w:sz w:val="20"/>
+              </w:rPr>
+              <w:t>Extensión pgcrypto</w:t>
+            </w:r>
+          </w:p>
+        </w:tc>
+        <w:tc>
+          <w:tcPr>
+            <w:tcW w:type="dxa" w:w="3969"/>
+          </w:tcPr>
+          <w:p>
+            <w:r/>
+            <w:r>
+              <w:rPr>
+                <w:sz w:val="20"/>
+              </w:rPr>
+              <w:t>Habilita la generación de identificadores uuid y funciones de apoyo para el modelo de datos</w:t>
+            </w:r>
+          </w:p>
+        </w:tc>
+        <w:tc>
+          <w:tcPr>
+            <w:tcW w:type="dxa" w:w="2948"/>
+          </w:tcPr>
+          <w:p>
+            <w:r/>
+            <w:r>
+              <w:rPr>
+                <w:sz w:val="20"/>
+              </w:rPr>
+              <w:t>Sentencia create extension if not exists pgcrypto en esquema.sql</w:t>
+            </w:r>
+          </w:p>
+        </w:tc>
+      </w:tr>
+      <w:tr>
+        <w:trPr>
+          <w:cantSplit w:val="true"/>
+        </w:trPr>
+        <w:tc>
+          <w:tcPr>
+            <w:tcW w:type="dxa" w:w="2154"/>
+          </w:tcPr>
+          <w:p>
+            <w:r/>
+            <w:r>
+              <w:rPr>
+                <w:sz w:val="20"/>
+              </w:rPr>
+              <w:t>PostgREST (API REST)</w:t>
+            </w:r>
+          </w:p>
+        </w:tc>
+        <w:tc>
+          <w:tcPr>
+            <w:tcW w:type="dxa" w:w="3969"/>
+          </w:tcPr>
+          <w:p>
+            <w:r/>
+            <w:r>
+              <w:rPr>
+                <w:sz w:val="20"/>
+              </w:rPr>
+              <w:t>Expone las tablas como endpoints JSON que consume la aplicación mediante el SDK de Supabase</w:t>
+            </w:r>
+          </w:p>
+        </w:tc>
+        <w:tc>
+          <w:tcPr>
+            <w:tcW w:type="dxa" w:w="2948"/>
+          </w:tcPr>
+          <w:p>
+            <w:r/>
+            <w:r>
+              <w:rPr>
+                <w:sz w:val="20"/>
+              </w:rPr>
+              <w:t>Consultas verificadas por la colección de pruebas (8 lecturas de tabla)</w:t>
+            </w:r>
+          </w:p>
+        </w:tc>
+      </w:tr>
+      <w:tr>
+        <w:trPr>
+          <w:cantSplit w:val="true"/>
+        </w:trPr>
+        <w:tc>
+          <w:tcPr>
+            <w:tcW w:type="dxa" w:w="2154"/>
+          </w:tcPr>
+          <w:p>
+            <w:r/>
+            <w:r>
+              <w:rPr>
+                <w:sz w:val="20"/>
+              </w:rPr>
+              <w:t>GoTrue (autenticación)</w:t>
+            </w:r>
+          </w:p>
+        </w:tc>
+        <w:tc>
+          <w:tcPr>
+            <w:tcW w:type="dxa" w:w="3969"/>
+          </w:tcPr>
+          <w:p>
+            <w:r/>
+            <w:r>
+              <w:rPr>
+                <w:sz w:val="20"/>
+              </w:rPr>
+              <w:t>Gestiona el registro, la confirmación y el inicio de sesión, y emite el access_token que autoriza las lecturas</w:t>
+            </w:r>
+          </w:p>
+        </w:tc>
+        <w:tc>
+          <w:tcPr>
+            <w:tcW w:type="dxa" w:w="2948"/>
+          </w:tcPr>
+          <w:p>
+            <w:r/>
+            <w:r>
+              <w:rPr>
+                <w:sz w:val="20"/>
+              </w:rPr>
+              <w:t>Etapa «api» del pipeline, verificada con las 26 aserciones de la colección</w:t>
+            </w:r>
+          </w:p>
+        </w:tc>
+      </w:tr>
+      <w:tr>
+        <w:trPr>
+          <w:cantSplit w:val="true"/>
+        </w:trPr>
+        <w:tc>
+          <w:tcPr>
+            <w:tcW w:type="dxa" w:w="2154"/>
+          </w:tcPr>
+          <w:p>
+            <w:r/>
+            <w:r>
+              <w:rPr>
+                <w:sz w:val="20"/>
+              </w:rPr>
+              <w:t>Row Level Security</w:t>
+            </w:r>
+          </w:p>
+        </w:tc>
+        <w:tc>
+          <w:tcPr>
+            <w:tcW w:type="dxa" w:w="3969"/>
+          </w:tcPr>
+          <w:p>
+            <w:r/>
+            <w:r>
+              <w:rPr>
+                <w:sz w:val="20"/>
+              </w:rPr>
+              <w:t>Restringe el acceso a cada tabla según el rol del usuario autenticado</w:t>
+            </w:r>
+          </w:p>
+        </w:tc>
+        <w:tc>
+          <w:tcPr>
+            <w:tcW w:type="dxa" w:w="2948"/>
+          </w:tcPr>
+          <w:p>
+            <w:r/>
+            <w:r>
+              <w:rPr>
+                <w:sz w:val="20"/>
+              </w:rPr>
+              <w:t>Función public.es_admin() y políticas create policy sobre las 8 tablas</w:t>
+            </w:r>
+          </w:p>
+        </w:tc>
+      </w:tr>
+      <w:tr>
+        <w:trPr>
+          <w:cantSplit w:val="true"/>
+        </w:trPr>
+        <w:tc>
+          <w:tcPr>
+            <w:tcW w:type="dxa" w:w="2154"/>
+          </w:tcPr>
+          <w:p>
+            <w:r/>
+            <w:r>
+              <w:rPr>
+                <w:sz w:val="20"/>
+              </w:rPr>
+              <w:t>Automatización de perfiles</w:t>
+            </w:r>
+          </w:p>
+        </w:tc>
+        <w:tc>
+          <w:tcPr>
+            <w:tcW w:type="dxa" w:w="3969"/>
+          </w:tcPr>
+          <w:p>
+            <w:r/>
+            <w:r>
+              <w:rPr>
+                <w:sz w:val="20"/>
+              </w:rPr>
+              <w:t>El trigger on_auth_user_created invoca public.crear_perfil() para crear la fila en public.usuarios al registrarse</w:t>
+            </w:r>
+          </w:p>
+        </w:tc>
+        <w:tc>
+          <w:tcPr>
+            <w:tcW w:type="dxa" w:w="2948"/>
+          </w:tcPr>
+          <w:p>
+            <w:r/>
+            <w:r>
+              <w:rPr>
+                <w:sz w:val="20"/>
+              </w:rPr>
+              <w:t>Definido en esquema.sql</w:t>
+            </w:r>
+          </w:p>
+        </w:tc>
+      </w:tr>
+      <w:tr>
+        <w:trPr>
+          <w:cantSplit w:val="true"/>
+        </w:trPr>
+        <w:tc>
+          <w:tcPr>
+            <w:tcW w:type="dxa" w:w="2154"/>
+          </w:tcPr>
+          <w:p>
+            <w:r/>
+            <w:r>
+              <w:rPr>
+                <w:sz w:val="20"/>
+              </w:rPr>
+              <w:t>Mecanismo de autenticación</w:t>
+            </w:r>
+          </w:p>
+        </w:tc>
+        <w:tc>
+          <w:tcPr>
+            <w:tcW w:type="dxa" w:w="3969"/>
+          </w:tcPr>
+          <w:p>
+            <w:r/>
+            <w:r>
+              <w:rPr>
+                <w:sz w:val="20"/>
+              </w:rPr>
+              <w:t>Clave pública (sb_publishable_…) entregada al cliente y clave de servicio (service_role) reservada a las tareas administrativas del backend</w:t>
+            </w:r>
+          </w:p>
+        </w:tc>
+        <w:tc>
+          <w:tcPr>
+            <w:tcW w:type="dxa" w:w="2948"/>
+          </w:tcPr>
+          <w:p>
+            <w:r/>
+            <w:r>
+              <w:rPr>
+                <w:sz w:val="20"/>
+              </w:rPr>
+              <w:t>Configuración de claves del proyecto Supabase</w:t>
+            </w:r>
+          </w:p>
+        </w:tc>
+      </w:tr>
+    </w:tbl>
+    <w:p/>
+    <w:p>
+      <w:pPr>
+        <w:pStyle w:val="Heading2"/>
+      </w:pPr>
+      <w:r>
+        <w:rPr>
+          <w:color w:val="1E40AF"/>
+        </w:rPr>
+        <w:t>4.6 Entorno de ejecución en el dispositivo cliente</w:t>
+      </w:r>
+    </w:p>
+    <w:p>
+      <w:r>
+        <w:rPr>
+          <w:b w:val="0"/>
+          <w:i w:val="0"/>
+          <w:sz w:val="24"/>
+        </w:rPr>
+        <w:t>La versión 1.0 de FitCore se publica como aplicación Android. El identificador de la aplicación es com.fitcore.fitcore y la versión declarada en pubspec.yaml es 1.0.0+1, que se traslada al versionName y al versionCode del paquete Android.</w:t>
+      </w:r>
+    </w:p>
+    <w:tbl>
+      <w:tblPr>
+        <w:tblStyle w:val="LightGrid-Accent1"/>
+        <w:tblW w:type="auto" w:w="0"/>
+        <w:jc w:val="center"/>
+        <w:tblLayout w:type="fixed"/>
+        <w:tblLook w:firstColumn="1" w:firstRow="1" w:lastColumn="0" w:lastRow="0" w:noHBand="0" w:noVBand="1" w:val="04A0"/>
+        <w:tblLayout w:type="fixed"/>
+      </w:tblPr>
+      <w:tblGrid>
+        <w:gridCol w:w="4703"/>
+        <w:gridCol w:w="4703"/>
+      </w:tblGrid>
+      <w:tr>
+        <w:trPr>
+          <w:tblHeader w:val="true"/>
+          <w:cantSplit w:val="true"/>
+        </w:trPr>
+        <w:tc>
+          <w:tcPr>
+            <w:tcW w:type="dxa" w:w="2268"/>
+          </w:tcPr>
+          <w:p>
+            <w:r/>
+            <w:r>
+              <w:rPr>
+                <w:b/>
+                <w:sz w:val="20"/>
+              </w:rPr>
+              <w:t>Requisito de ejecución</w:t>
+            </w:r>
+          </w:p>
+        </w:tc>
+        <w:tc>
+          <w:tcPr>
+            <w:tcW w:type="dxa" w:w="6803"/>
+          </w:tcPr>
+          <w:p>
+            <w:r/>
+            <w:r>
+              <w:rPr>
+                <w:b/>
+                <w:sz w:val="20"/>
+              </w:rPr>
+              <w:t>Valor / comportamiento verificado</w:t>
+            </w:r>
+          </w:p>
+        </w:tc>
+      </w:tr>
+      <w:tr>
+        <w:trPr>
+          <w:cantSplit w:val="true"/>
+        </w:trPr>
+        <w:tc>
+          <w:tcPr>
+            <w:tcW w:type="dxa" w:w="2268"/>
+          </w:tcPr>
+          <w:p>
+            <w:r/>
+            <w:r>
+              <w:rPr>
+                <w:sz w:val="20"/>
+              </w:rPr>
+              <w:t>Plataforma objetivo</w:t>
+            </w:r>
+          </w:p>
+        </w:tc>
+        <w:tc>
+          <w:tcPr>
+            <w:tcW w:type="dxa" w:w="6803"/>
+          </w:tcPr>
+          <w:p>
+            <w:r/>
+            <w:r>
+              <w:rPr>
+                <w:sz w:val="20"/>
+              </w:rPr>
+              <w:t>Android (applicationId com.fitcore.fitcore)</w:t>
+            </w:r>
+          </w:p>
+        </w:tc>
+      </w:tr>
+      <w:tr>
+        <w:trPr>
+          <w:cantSplit w:val="true"/>
+        </w:trPr>
+        <w:tc>
+          <w:tcPr>
+            <w:tcW w:type="dxa" w:w="2268"/>
+          </w:tcPr>
+          <w:p>
+            <w:r/>
+            <w:r>
+              <w:rPr>
+                <w:sz w:val="20"/>
+              </w:rPr>
+              <w:t>Versión mínima y objetivo</w:t>
+            </w:r>
+          </w:p>
+        </w:tc>
+        <w:tc>
+          <w:tcPr>
+            <w:tcW w:type="dxa" w:w="6803"/>
+          </w:tcPr>
+          <w:p>
+            <w:r/>
+            <w:r>
+              <w:rPr>
+                <w:sz w:val="20"/>
+              </w:rPr>
+              <w:t>minSdk y targetSdk se heredan de los valores por defecto declarados por Flutter (flutter.minSdkVersion y flutter.targetSdkVersion); el requisito efectivo queda fijado, por tanto, por la versión de Flutter 3.47.5 con la que se compila</w:t>
+            </w:r>
+          </w:p>
+        </w:tc>
+      </w:tr>
+      <w:tr>
+        <w:trPr>
+          <w:cantSplit w:val="true"/>
+        </w:trPr>
+        <w:tc>
+          <w:tcPr>
+            <w:tcW w:type="dxa" w:w="2268"/>
+          </w:tcPr>
+          <w:p>
+            <w:r/>
+            <w:r>
+              <w:rPr>
+                <w:sz w:val="20"/>
+              </w:rPr>
+              <w:t>Niveles de API de compilación</w:t>
+            </w:r>
+          </w:p>
+        </w:tc>
+        <w:tc>
+          <w:tcPr>
+            <w:tcW w:type="dxa" w:w="6803"/>
+          </w:tcPr>
+          <w:p>
+            <w:r/>
+            <w:r>
+              <w:rPr>
+                <w:sz w:val="20"/>
+              </w:rPr>
+              <w:t>compileSdk heredado de Flutter; NDK 28.2.13676358 declarado de forma explícita</w:t>
+            </w:r>
+          </w:p>
+        </w:tc>
+      </w:tr>
+      <w:tr>
+        <w:trPr>
+          <w:cantSplit w:val="true"/>
+        </w:trPr>
+        <w:tc>
+          <w:tcPr>
+            <w:tcW w:type="dxa" w:w="2268"/>
+          </w:tcPr>
+          <w:p>
+            <w:r/>
+            <w:r>
+              <w:rPr>
+                <w:sz w:val="20"/>
+              </w:rPr>
+              <w:t>Permisos solicitados</w:t>
+            </w:r>
+          </w:p>
+        </w:tc>
+        <w:tc>
+          <w:tcPr>
+            <w:tcW w:type="dxa" w:w="6803"/>
+          </w:tcPr>
+          <w:p>
+            <w:r/>
+            <w:r>
+              <w:rPr>
+                <w:sz w:val="20"/>
+              </w:rPr>
+              <w:t>Únicamente android.permission.INTERNET, declarado expresamente para la conexión con Supabase (login y datos del panel). La aplicación no solicita cámara, micrófono, GPS, notificaciones, contactos, SMS ni almacenamiento externo</w:t>
+            </w:r>
+          </w:p>
+        </w:tc>
+      </w:tr>
+      <w:tr>
+        <w:trPr>
+          <w:cantSplit w:val="true"/>
+        </w:trPr>
+        <w:tc>
+          <w:tcPr>
+            <w:tcW w:type="dxa" w:w="2268"/>
+          </w:tcPr>
+          <w:p>
+            <w:r/>
+            <w:r>
+              <w:rPr>
+                <w:sz w:val="20"/>
+              </w:rPr>
+              <w:t>Firmado del artefacto</w:t>
+            </w:r>
+          </w:p>
+        </w:tc>
+        <w:tc>
+          <w:tcPr>
+            <w:tcW w:type="dxa" w:w="6803"/>
+          </w:tcPr>
+          <w:p>
+            <w:r/>
+            <w:r>
+              <w:rPr>
+                <w:sz w:val="20"/>
+              </w:rPr>
+              <w:t>La variante release se firma con la clave de depuración (signingConfig debug) conforme a android/app/build.gradle.kts; el uso de un keystore de publicación queda identificado como trabajo pendiente para el apartado de publicación y distribución</w:t>
+            </w:r>
+          </w:p>
+        </w:tc>
+      </w:tr>
+      <w:tr>
+        <w:trPr>
+          <w:cantSplit w:val="true"/>
+        </w:trPr>
+        <w:tc>
+          <w:tcPr>
+            <w:tcW w:type="dxa" w:w="2268"/>
+          </w:tcPr>
+          <w:p>
+            <w:r/>
+            <w:r>
+              <w:rPr>
+                <w:sz w:val="20"/>
+              </w:rPr>
+              <w:t>Canal de distribución</w:t>
+            </w:r>
+          </w:p>
+        </w:tc>
+        <w:tc>
+          <w:tcPr>
+            <w:tcW w:type="dxa" w:w="6803"/>
+          </w:tcPr>
+          <w:p>
+            <w:r/>
+            <w:r>
+              <w:rPr>
+                <w:sz w:val="20"/>
+              </w:rPr>
+              <w:t>GitHub Releases: el artefacto app-release.apk de 55,2 MB queda publicado y descargable bajo una URL estable por cada build</w:t>
+            </w:r>
+          </w:p>
+        </w:tc>
+      </w:tr>
+      <w:tr>
+        <w:trPr>
+          <w:cantSplit w:val="true"/>
+        </w:trPr>
+        <w:tc>
+          <w:tcPr>
+            <w:tcW w:type="dxa" w:w="2268"/>
+          </w:tcPr>
+          <w:p>
+            <w:r/>
+            <w:r>
+              <w:rPr>
+                <w:sz w:val="20"/>
+              </w:rPr>
+              <w:t>Comportamiento sin backend</w:t>
+            </w:r>
+          </w:p>
+        </w:tc>
+        <w:tc>
+          <w:tcPr>
+            <w:tcW w:type="dxa" w:w="6803"/>
+          </w:tcPr>
+          <w:p>
+            <w:r/>
+            <w:r>
+              <w:rPr>
+                <w:sz w:val="20"/>
+              </w:rPr>
+              <w:t>Si no se inyectan credenciales, la aplicación arranca en modo demo con la base en memoria DemoDB y el usuario admin@fitcore.com / admin123, lo que permite operarla y probarla sin conectividad</w:t>
+            </w:r>
+          </w:p>
+        </w:tc>
+      </w:tr>
+    </w:tbl>
+    <w:p/>
+    <w:p>
+      <w:r>
+        <w:rPr>
+          <w:i/>
+          <w:color w:val="444444"/>
+          <w:sz w:val="20"/>
+        </w:rPr>
+        <w:t>Nota: la ausencia de permisos especiales es un dato favorable del producto y se documenta aquí porque la rúbrica de la unidad exige declarar la lista de permisos especiales que aplican al funcionamiento del software en los dispositivos de los clientes (apartado III.5 de la guía F-DIR-43).</w:t>
+      </w:r>
+    </w:p>
+    <w:p>
+      <w:pPr>
+        <w:pStyle w:val="Heading2"/>
+      </w:pPr>
+      <w:r>
+        <w:rPr>
+          <w:color w:val="1E40AF"/>
+        </w:rPr>
+        <w:t>4.7 Configuración del entorno y gestión de secretos</w:t>
+      </w:r>
+    </w:p>
+    <w:p>
+      <w:r>
+        <w:rPr>
+          <w:b w:val="0"/>
+          <w:i w:val="0"/>
+          <w:sz w:val="24"/>
+        </w:rPr>
+        <w:t>El entorno se parametriza, no se codifica. La clase ConfigSupabase (lib/core/config_supabase.dart) resuelve la configuración en este orden: primero las constantes del propio código, que permanecen vacías en el repositorio, y después las variables inyectadas en tiempo de compilación mediante --dart-define. De este modo, el mismo código fuente sirve para desarrollo, pruebas, demostración y publicación, sin que exista ninguna credencial versionada.</w:t>
+      </w:r>
+    </w:p>
+    <w:tbl>
+      <w:tblPr>
+        <w:tblStyle w:val="LightGrid-Accent1"/>
+        <w:tblW w:type="auto" w:w="0"/>
+        <w:jc w:val="center"/>
+        <w:tblLayout w:type="fixed"/>
+        <w:tblLook w:firstColumn="1" w:firstRow="1" w:lastColumn="0" w:lastRow="0" w:noHBand="0" w:noVBand="1" w:val="04A0"/>
+        <w:tblLayout w:type="fixed"/>
+      </w:tblPr>
+      <w:tblGrid>
+        <w:gridCol w:w="2351"/>
+        <w:gridCol w:w="2351"/>
+        <w:gridCol w:w="2351"/>
+        <w:gridCol w:w="2351"/>
+      </w:tblGrid>
+      <w:tr>
+        <w:trPr>
+          <w:tblHeader w:val="true"/>
+          <w:cantSplit w:val="true"/>
+        </w:trPr>
+        <w:tc>
+          <w:tcPr>
+            <w:tcW w:type="dxa" w:w="2154"/>
+          </w:tcPr>
+          <w:p>
+            <w:r/>
+            <w:r>
+              <w:rPr>
+                <w:b/>
+                <w:sz w:val="20"/>
+              </w:rPr>
+              <w:t>Parámetro</w:t>
+            </w:r>
+          </w:p>
+        </w:tc>
+        <w:tc>
+          <w:tcPr>
+            <w:tcW w:type="dxa" w:w="2268"/>
+          </w:tcPr>
+          <w:p>
+            <w:r/>
+            <w:r>
+              <w:rPr>
+                <w:b/>
+                <w:sz w:val="20"/>
+              </w:rPr>
+              <w:t>Valor</w:t>
+            </w:r>
+          </w:p>
+        </w:tc>
+        <w:tc>
+          <w:tcPr>
+            <w:tcW w:type="dxa" w:w="2381"/>
+          </w:tcPr>
+          <w:p>
+            <w:r/>
+            <w:r>
+              <w:rPr>
+                <w:b/>
+                <w:sz w:val="20"/>
+              </w:rPr>
+              <w:t>Dónde se define</w:t>
+            </w:r>
+          </w:p>
+        </w:tc>
+        <w:tc>
+          <w:tcPr>
+            <w:tcW w:type="dxa" w:w="2268"/>
+          </w:tcPr>
+          <w:p>
+            <w:r/>
+            <w:r>
+              <w:rPr>
+                <w:b/>
+                <w:sz w:val="20"/>
+              </w:rPr>
+              <w:t>Destino</w:t>
+            </w:r>
+          </w:p>
+        </w:tc>
+      </w:tr>
+      <w:tr>
+        <w:trPr>
+          <w:cantSplit w:val="true"/>
+        </w:trPr>
+        <w:tc>
+          <w:tcPr>
+            <w:tcW w:type="dxa" w:w="2154"/>
+          </w:tcPr>
+          <w:p>
+            <w:r/>
+            <w:r>
+              <w:rPr>
+                <w:sz w:val="20"/>
+              </w:rPr>
+              <w:t>SUPABASE_URL</w:t>
+            </w:r>
+          </w:p>
+        </w:tc>
+        <w:tc>
+          <w:tcPr>
+            <w:tcW w:type="dxa" w:w="2268"/>
+          </w:tcPr>
+          <w:p>
+            <w:r/>
+            <w:r>
+              <w:rPr>
+                <w:sz w:val="20"/>
+              </w:rPr>
+              <w:t>URL del proyecto de Supabase</w:t>
+            </w:r>
+          </w:p>
+        </w:tc>
+        <w:tc>
+          <w:tcPr>
+            <w:tcW w:type="dxa" w:w="2381"/>
+          </w:tcPr>
+          <w:p>
+            <w:r/>
+            <w:r>
+              <w:rPr>
+                <w:sz w:val="20"/>
+              </w:rPr>
+              <w:t>Secreto del repositorio (GitHub Actions)</w:t>
+            </w:r>
+          </w:p>
+        </w:tc>
+        <w:tc>
+          <w:tcPr>
+            <w:tcW w:type="dxa" w:w="2268"/>
+          </w:tcPr>
+          <w:p>
+            <w:r/>
+            <w:r>
+              <w:rPr>
+                <w:sz w:val="20"/>
+              </w:rPr>
+              <w:t>Variable SUPABASE_URL de la etapa «api» y --dart-define en la etapa «construye»</w:t>
+            </w:r>
+          </w:p>
+        </w:tc>
+      </w:tr>
+      <w:tr>
+        <w:trPr>
+          <w:cantSplit w:val="true"/>
+        </w:trPr>
+        <w:tc>
+          <w:tcPr>
+            <w:tcW w:type="dxa" w:w="2154"/>
+          </w:tcPr>
+          <w:p>
+            <w:r/>
+            <w:r>
+              <w:rPr>
+                <w:sz w:val="20"/>
+              </w:rPr>
+              <w:t>SUPABASE_ANON_KEY</w:t>
+            </w:r>
+          </w:p>
+        </w:tc>
+        <w:tc>
+          <w:tcPr>
+            <w:tcW w:type="dxa" w:w="2268"/>
+          </w:tcPr>
+          <w:p>
+            <w:r/>
+            <w:r>
+              <w:rPr>
+                <w:sz w:val="20"/>
+              </w:rPr>
+              <w:t>Clave pública del proyecto (sb_publishable_…)</w:t>
+            </w:r>
+          </w:p>
+        </w:tc>
+        <w:tc>
+          <w:tcPr>
+            <w:tcW w:type="dxa" w:w="2381"/>
+          </w:tcPr>
+          <w:p>
+            <w:r/>
+            <w:r>
+              <w:rPr>
+                <w:sz w:val="20"/>
+              </w:rPr>
+              <w:t>Secreto del repositorio</w:t>
+            </w:r>
+          </w:p>
+        </w:tc>
+        <w:tc>
+          <w:tcPr>
+            <w:tcW w:type="dxa" w:w="2268"/>
+          </w:tcPr>
+          <w:p>
+            <w:r/>
+            <w:r>
+              <w:rPr>
+                <w:sz w:val="20"/>
+              </w:rPr>
+              <w:t>Variable anonKey de Newman y --dart-define SUPABASE_ANON_KEY</w:t>
+            </w:r>
+          </w:p>
+        </w:tc>
+      </w:tr>
+      <w:tr>
+        <w:trPr>
+          <w:cantSplit w:val="true"/>
+        </w:trPr>
+        <w:tc>
+          <w:tcPr>
+            <w:tcW w:type="dxa" w:w="2154"/>
+          </w:tcPr>
+          <w:p>
+            <w:r/>
+            <w:r>
+              <w:rPr>
+                <w:sz w:val="20"/>
+              </w:rPr>
+              <w:t>FITCORE_TEST_EMAIL</w:t>
+            </w:r>
+          </w:p>
+        </w:tc>
+        <w:tc>
+          <w:tcPr>
+            <w:tcW w:type="dxa" w:w="2268"/>
+          </w:tcPr>
+          <w:p>
+            <w:r/>
+            <w:r>
+              <w:rPr>
+                <w:sz w:val="20"/>
+              </w:rPr>
+              <w:t>Correo del usuario de prueba</w:t>
+            </w:r>
+          </w:p>
+        </w:tc>
+        <w:tc>
+          <w:tcPr>
+            <w:tcW w:type="dxa" w:w="2381"/>
+          </w:tcPr>
+          <w:p>
+            <w:r/>
+            <w:r>
+              <w:rPr>
+                <w:sz w:val="20"/>
+              </w:rPr>
+              <w:t>Secreto del repositorio</w:t>
+            </w:r>
+          </w:p>
+        </w:tc>
+        <w:tc>
+          <w:tcPr>
+            <w:tcW w:type="dxa" w:w="2268"/>
+          </w:tcPr>
+          <w:p>
+            <w:r/>
+            <w:r>
+              <w:rPr>
+                <w:sz w:val="20"/>
+              </w:rPr>
+              <w:t>Variable email del entorno de Newman</w:t>
+            </w:r>
+          </w:p>
+        </w:tc>
+      </w:tr>
+      <w:tr>
+        <w:trPr>
+          <w:cantSplit w:val="true"/>
+        </w:trPr>
+        <w:tc>
+          <w:tcPr>
+            <w:tcW w:type="dxa" w:w="2154"/>
+          </w:tcPr>
+          <w:p>
+            <w:r/>
+            <w:r>
+              <w:rPr>
+                <w:sz w:val="20"/>
+              </w:rPr>
+              <w:t>FITCORE_TEST_PASSWORD</w:t>
+            </w:r>
+          </w:p>
+        </w:tc>
+        <w:tc>
+          <w:tcPr>
+            <w:tcW w:type="dxa" w:w="2268"/>
+          </w:tcPr>
+          <w:p>
+            <w:r/>
+            <w:r>
+              <w:rPr>
+                <w:sz w:val="20"/>
+              </w:rPr>
+              <w:t>Contraseña del usuario de prueba</w:t>
+            </w:r>
+          </w:p>
+        </w:tc>
+        <w:tc>
+          <w:tcPr>
+            <w:tcW w:type="dxa" w:w="2381"/>
+          </w:tcPr>
+          <w:p>
+            <w:r/>
+            <w:r>
+              <w:rPr>
+                <w:sz w:val="20"/>
+              </w:rPr>
+              <w:t>Secreto del repositorio</w:t>
+            </w:r>
+          </w:p>
+        </w:tc>
+        <w:tc>
+          <w:tcPr>
+            <w:tcW w:type="dxa" w:w="2268"/>
+          </w:tcPr>
+          <w:p>
+            <w:r/>
+            <w:r>
+              <w:rPr>
+                <w:sz w:val="20"/>
+              </w:rPr>
+              <w:t>Variable password del entorno de Newman</w:t>
+            </w:r>
+          </w:p>
+        </w:tc>
+      </w:tr>
+      <w:tr>
+        <w:trPr>
+          <w:cantSplit w:val="true"/>
+        </w:trPr>
+        <w:tc>
+          <w:tcPr>
+            <w:tcW w:type="dxa" w:w="2154"/>
+          </w:tcPr>
+          <w:p>
+            <w:r/>
+            <w:r>
+              <w:rPr>
+                <w:sz w:val="20"/>
+              </w:rPr>
+              <w:t>SUPABASE_URL y SUPABASE_ANON_KEY</w:t>
+            </w:r>
+          </w:p>
+        </w:tc>
+        <w:tc>
+          <w:tcPr>
+            <w:tcW w:type="dxa" w:w="2268"/>
+          </w:tcPr>
+          <w:p>
+            <w:r/>
+            <w:r>
+              <w:rPr>
+                <w:sz w:val="20"/>
+              </w:rPr>
+              <w:t>Inyectadas en el binario</w:t>
+            </w:r>
+          </w:p>
+        </w:tc>
+        <w:tc>
+          <w:tcPr>
+            <w:tcW w:type="dxa" w:w="2381"/>
+          </w:tcPr>
+          <w:p>
+            <w:r/>
+            <w:r>
+              <w:rPr>
+                <w:sz w:val="20"/>
+              </w:rPr>
+              <w:t>--dart-define en la etapa de compilación</w:t>
+            </w:r>
+          </w:p>
+        </w:tc>
+        <w:tc>
+          <w:tcPr>
+            <w:tcW w:type="dxa" w:w="2268"/>
+          </w:tcPr>
+          <w:p>
+            <w:r/>
+            <w:r>
+              <w:rPr>
+                <w:sz w:val="20"/>
+              </w:rPr>
+              <w:t>ConfigSupabase.url y ConfigSupabase.anonKey en tiempo de ejecución</w:t>
+            </w:r>
+          </w:p>
+        </w:tc>
+      </w:tr>
+    </w:tbl>
+    <w:p/>
+    <w:p>
+      <w:r>
+        <w:rPr>
+          <w:b w:val="0"/>
+          <w:i w:val="0"/>
+          <w:sz w:val="24"/>
+        </w:rPr>
+        <w:t>Los cuatro parámetros del pipeline existen como secretos cifrados del repositorio: GitHub los enmascara en los registros de la ejecución y solo los entrega a la etapa que los consume. Ninguno de ellos está en el código fuente ni en el historial de commits, y el documento lo hace explícito precisamente porque el diagnóstico de la incidencia descrita en el apartado 3.10 se produjo en esta frontera: la credencial obsoleta no estaba en el repositorio, sino en la configuración del entorno de ejecución.</w:t>
+      </w:r>
+    </w:p>
+    <w:p>
+      <w:pPr>
+        <w:pStyle w:val="Heading2"/>
+      </w:pPr>
+      <w:r>
+        <w:rPr>
+          <w:color w:val="1E40AF"/>
+        </w:rPr>
+        <w:t>4.8 Verificación y reproducibilidad del entorno</w:t>
+      </w:r>
+    </w:p>
+    <w:p>
+      <w:r>
+        <w:rPr>
+          <w:b w:val="0"/>
+          <w:i w:val="0"/>
+          <w:sz w:val="24"/>
+        </w:rPr>
+        <w:t>El repositorio incluye un conjunto de scripts que materializan la preparación del entorno tanto en el equipo como en el servidor de integración continua, de modo que la comprobación es reproducible y no depende de la memoria del integrante:</w:t>
+      </w:r>
+    </w:p>
+    <w:tbl>
+      <w:tblPr>
+        <w:tblStyle w:val="LightGrid-Accent1"/>
+        <w:tblW w:type="auto" w:w="0"/>
+        <w:jc w:val="center"/>
+        <w:tblLayout w:type="fixed"/>
+        <w:tblLook w:firstColumn="1" w:firstRow="1" w:lastColumn="0" w:lastRow="0" w:noHBand="0" w:noVBand="1" w:val="04A0"/>
+        <w:tblLayout w:type="fixed"/>
+      </w:tblPr>
+      <w:tblGrid>
+        <w:gridCol w:w="3135"/>
+        <w:gridCol w:w="3135"/>
+        <w:gridCol w:w="3135"/>
+      </w:tblGrid>
+      <w:tr>
+        <w:trPr>
+          <w:tblHeader w:val="true"/>
+          <w:cantSplit w:val="true"/>
+        </w:trPr>
+        <w:tc>
+          <w:tcPr>
+            <w:tcW w:type="dxa" w:w="2608"/>
+          </w:tcPr>
+          <w:p>
+            <w:r/>
+            <w:r>
+              <w:rPr>
+                <w:b/>
+                <w:sz w:val="20"/>
+              </w:rPr>
+              <w:t>Script</w:t>
+            </w:r>
+          </w:p>
+        </w:tc>
+        <w:tc>
+          <w:tcPr>
+            <w:tcW w:type="dxa" w:w="1928"/>
+          </w:tcPr>
+          <w:p>
+            <w:r/>
+            <w:r>
+              <w:rPr>
+                <w:b/>
+                <w:sz w:val="20"/>
+              </w:rPr>
+              <w:t>Plataforma</w:t>
+            </w:r>
+          </w:p>
+        </w:tc>
+        <w:tc>
+          <w:tcPr>
+            <w:tcW w:type="dxa" w:w="4535"/>
+          </w:tcPr>
+          <w:p>
+            <w:r/>
+            <w:r>
+              <w:rPr>
+                <w:b/>
+                <w:sz w:val="20"/>
+              </w:rPr>
+              <w:t>Función</w:t>
+            </w:r>
+          </w:p>
+        </w:tc>
+      </w:tr>
+      <w:tr>
+        <w:trPr>
+          <w:cantSplit w:val="true"/>
+        </w:trPr>
+        <w:tc>
+          <w:tcPr>
+            <w:tcW w:type="dxa" w:w="2608"/>
+          </w:tcPr>
+          <w:p>
+            <w:r/>
+            <w:r>
+              <w:rPr>
+                <w:sz w:val="20"/>
+              </w:rPr>
+              <w:t>scripts/preparar_entorno.sh y .bat</w:t>
+            </w:r>
+          </w:p>
+        </w:tc>
+        <w:tc>
+          <w:tcPr>
+            <w:tcW w:type="dxa" w:w="1928"/>
+          </w:tcPr>
+          <w:p>
+            <w:r/>
+            <w:r>
+              <w:rPr>
+                <w:sz w:val="20"/>
+              </w:rPr>
+              <w:t>Linux/macOS y Windows</w:t>
+            </w:r>
+          </w:p>
+        </w:tc>
+        <w:tc>
+          <w:tcPr>
+            <w:tcW w:type="dxa" w:w="4535"/>
+          </w:tcPr>
+          <w:p>
+            <w:r/>
+            <w:r>
+              <w:rPr>
+                <w:sz w:val="20"/>
+              </w:rPr>
+              <w:t>Verifica Git, Flutter, Java 17 y Node, y resuelve las dependencias con flutter pub get (5 comprobaciones)</w:t>
+            </w:r>
+          </w:p>
+        </w:tc>
+      </w:tr>
+      <w:tr>
+        <w:trPr>
+          <w:cantSplit w:val="true"/>
+        </w:trPr>
+        <w:tc>
+          <w:tcPr>
+            <w:tcW w:type="dxa" w:w="2608"/>
+          </w:tcPr>
+          <w:p>
+            <w:r/>
+            <w:r>
+              <w:rPr>
+                <w:sz w:val="20"/>
+              </w:rPr>
+              <w:t>scripts/ejecutar_pruebas.sh y .bat</w:t>
+            </w:r>
+          </w:p>
+        </w:tc>
+        <w:tc>
+          <w:tcPr>
+            <w:tcW w:type="dxa" w:w="1928"/>
+          </w:tcPr>
+          <w:p>
+            <w:r/>
+            <w:r>
+              <w:rPr>
+                <w:sz w:val="20"/>
+              </w:rPr>
+              <w:t>Linux/macOS y Windows</w:t>
+            </w:r>
+          </w:p>
+        </w:tc>
+        <w:tc>
+          <w:tcPr>
+            <w:tcW w:type="dxa" w:w="4535"/>
+          </w:tcPr>
+          <w:p>
+            <w:r/>
+            <w:r>
+              <w:rPr>
+                <w:sz w:val="20"/>
+              </w:rPr>
+              <w:t>Ejecuta el análisis estático, las pruebas automatizadas y el resumen de cobertura</w:t>
+            </w:r>
+          </w:p>
+        </w:tc>
+      </w:tr>
+      <w:tr>
+        <w:trPr>
+          <w:cantSplit w:val="true"/>
+        </w:trPr>
+        <w:tc>
+          <w:tcPr>
+            <w:tcW w:type="dxa" w:w="2608"/>
+          </w:tcPr>
+          <w:p>
+            <w:r/>
+            <w:r>
+              <w:rPr>
+                <w:sz w:val="20"/>
+              </w:rPr>
+              <w:t>scripts/generar_despliegue.sh y .bat</w:t>
+            </w:r>
+          </w:p>
+        </w:tc>
+        <w:tc>
+          <w:tcPr>
+            <w:tcW w:type="dxa" w:w="1928"/>
+          </w:tcPr>
+          <w:p>
+            <w:r/>
+            <w:r>
+              <w:rPr>
+                <w:sz w:val="20"/>
+              </w:rPr>
+              <w:t>Linux/macOS y Windows</w:t>
+            </w:r>
+          </w:p>
+        </w:tc>
+        <w:tc>
+          <w:tcPr>
+            <w:tcW w:type="dxa" w:w="4535"/>
+          </w:tcPr>
+          <w:p>
+            <w:r/>
+            <w:r>
+              <w:rPr>
+                <w:sz w:val="20"/>
+              </w:rPr>
+              <w:t>Compila el APK de liberación inyectando la configuración por --dart-define</w:t>
+            </w:r>
+          </w:p>
+        </w:tc>
+      </w:tr>
+    </w:tbl>
+    <w:p/>
+    <w:p>
+      <w:r>
+        <w:rPr>
+          <w:b w:val="0"/>
+          <w:i w:val="0"/>
+          <w:sz w:val="24"/>
+        </w:rPr>
+        <w:t>La reproducibilidad se comprueba, además, de forma automática: la etapa «entorno» del pipeline ejecuta exactamente las mismas comprobaciones sobre la imagen ubuntu-latest y publica el resultado como artefacto, de modo que cada publicación del producto lleva asociado el entorno exacto en el que se construyó. Esta es la diferencia entre un proceso de entrega verificable y una compilación manual: el entorno deja de ser una descripción del documento y pasa a ser un dato comprobable de cada versión publicada.</w:t>
       </w:r>
     </w:p>
     <w:p>
@@ -7515,7 +10992,12 @@
           <w:color w:val="444444"/>
           <w:sz w:val="20"/>
         </w:rPr>
-        <w:t>Apartado reservado: se completa en la entrega del punto siguiente.</w:t>
+        <w:t>Observación de higiene del repositorio: la raíz del proyecto contiene una copia de la base de datos interna de Git (HEAD, config, index, hooks/, objects/ y refs/) y dos copias duplicadas del código (fitcore/ y Fitcore001/), que suman 257 de los 480 archivos versionados. No afectan al funcionamiento del producto ni a la reproducción del entorno, pero se recomienda retirarlos del control de versiones para que el historial y el peso del repositorio reflejen únicamente el código fuente del proyecto.</w:t>
+      </w:r>
+    </w:p>
+    <w:p>
+      <w:r>
+        <w:br w:type="page"/>
       </w:r>
     </w:p>
     <w:p>
@@ -7552,7 +11034,91 @@
         <w:rPr>
           <w:color w:val="1E40AF"/>
         </w:rPr>
-        <w:t>Referencias bibliográficas</w:t>
+        <w:t>6. Conclusiones de la entrega actual</w:t>
+      </w:r>
+    </w:p>
+    <w:p>
+      <w:r>
+        <w:rPr>
+          <w:b w:val="0"/>
+          <w:i w:val="0"/>
+          <w:sz w:val="24"/>
+        </w:rPr>
+        <w:t>La presente entrega documenta y verifica el proceso de integración, liberación y despliegue continuo del proyecto FitCore. Su contenido permite afirmar, con respaldo en datos extraídos del propio repositorio y de la propia plataforma, que el flujo de trabajo para la liberación y el despliegue continuo está implementado, es funcional, es selectivo y es trazable.</w:t>
+      </w:r>
+    </w:p>
+    <w:p>
+      <w:pPr>
+        <w:pStyle w:val="ListBullet"/>
+      </w:pPr>
+      <w:r>
+        <w:t>El flujo de trabajo está definido de forma declarativa en un único archivo (.github/workflows/ci-cd.yml, 260 líneas) con seis etapas, tres disparadores, control de concurrencia y una regla de publicación condicionada a la rama main.</w:t>
+      </w:r>
+    </w:p>
+    <w:p>
+      <w:pPr>
+        <w:pStyle w:val="ListBullet"/>
+      </w:pPr>
+      <w:r>
+        <w:t>El comportamiento del pipeline está verificado empíricamente: 24 ejecuciones registradas, de las cuales 10 concluyeron con éxito, y 9 publicaciones versionadas con su APK descargable.</w:t>
+      </w:r>
+    </w:p>
+    <w:p>
+      <w:pPr>
+        <w:pStyle w:val="ListBullet"/>
+      </w:pPr>
+      <w:r>
+        <w:t>Las etapas se ejecutan con un tiempo de reloj de 441 s (7 min 21 s) por línea de producción, lo que hace viable un SLA de entrega por debajo de los diez minutos con automatización completa.</w:t>
+      </w:r>
+    </w:p>
+    <w:p>
+      <w:pPr>
+        <w:pStyle w:val="ListBullet"/>
+      </w:pPr>
+      <w:r>
+        <w:t>La validación del contrato de la API se ejecuta de forma automatizada en cada integración (12 peticiones, 26 aserciones, 0 fallos), y constituye una puerta de calidad efectiva: las ejecuciones en las que el contrato no se cumplió bloquearon la publicación del APK.</w:t>
+      </w:r>
+    </w:p>
+    <w:p>
+      <w:pPr>
+        <w:pStyle w:val="ListBullet"/>
+      </w:pPr>
+      <w:r>
+        <w:t>El proceso demuestra capacidad de detección y de corrección: la identificación de una credencial obsoleta y de dos aserciones mal planteadas, su verificación local y su integración en la rama principal quedan documentadas en el apartado 3.10.</w:t>
+      </w:r>
+    </w:p>
+    <w:p>
+      <w:pPr>
+        <w:pStyle w:val="ListBullet"/>
+      </w:pPr>
+      <w:r>
+        <w:t>El entorno requerido por el proceso se declara de forma versionada y auditable en el apartado 4, con la fuente exacta de cada requisito.</w:t>
+      </w:r>
+    </w:p>
+    <w:p>
+      <w:r>
+        <w:rPr>
+          <w:b w:val="0"/>
+          <w:i w:val="0"/>
+          <w:sz w:val="24"/>
+        </w:rPr>
+        <w:t>Queda pendiente para las siguientes entregas el desarrollo de los apartados restantes (niveles de servicio, métricas, plan de pruebas y publicación y distribución del software), así como la incorporación de las capturas de pantalla listadas en el apartado 3.11, que requieren la intervención manual de la alumna sobre las interfaces de GitHub, Supabase y el dispositivo.</w:t>
+      </w:r>
+    </w:p>
+    <w:p>
+      <w:r>
+        <w:br w:type="page"/>
+      </w:r>
+    </w:p>
+    <w:p>
+      <w:pPr>
+        <w:pStyle w:val="Heading1"/>
+      </w:pPr>
+      <w:r>
+        <w:rPr>
+          <w:color w:val="1E40AF"/>
+        </w:rPr>
+        <w:t>7. Referencias bibliográficas</w:t>
       </w:r>
     </w:p>
     <w:p>

</xml_diff>